<commit_message>
feat(ape-3): add wait scatter plot to code and individual report
</commit_message>
<xml_diff>
--- a/unidad-1/ape-3-mm1/documento/APE3.docx
+++ b/unidad-1/ape-3-mm1/documento/APE3.docx
@@ -2570,6 +2570,97 @@
     </w:p>
     <w:p>
       <w:pPr>
+        <w:keepNext/>
+        <w:jc w:val="center"/>
+      </w:pPr>
+      <w:r>
+        <w:drawing>
+          <wp:inline xmlns:a="http://schemas.openxmlformats.org/drawingml/2006/main" xmlns:pic="http://schemas.openxmlformats.org/drawingml/2006/picture">
+            <wp:extent cx="5760000" cy="4398545"/>
+            <wp:docPr id="8" name="Picture 8"/>
+            <wp:cNvGraphicFramePr>
+              <a:graphicFrameLocks noChangeAspect="1"/>
+            </wp:cNvGraphicFramePr>
+            <a:graphic>
+              <a:graphicData uri="http://schemas.openxmlformats.org/drawingml/2006/picture">
+                <pic:pic>
+                  <pic:nvPicPr>
+                    <pic:cNvPr id="0" name="dispersion_espera.png"/>
+                    <pic:cNvPicPr/>
+                  </pic:nvPicPr>
+                  <pic:blipFill>
+                    <a:blip r:embed="rId17"/>
+                    <a:stretch>
+                      <a:fillRect/>
+                    </a:stretch>
+                  </pic:blipFill>
+                  <pic:spPr>
+                    <a:xfrm>
+                      <a:off x="0" y="0"/>
+                      <a:ext cx="5760000" cy="4398545"/>
+                    </a:xfrm>
+                    <a:prstGeom prst="rect"/>
+                  </pic:spPr>
+                </pic:pic>
+              </a:graphicData>
+            </a:graphic>
+          </wp:inline>
+        </w:drawing>
+      </w:r>
+    </w:p>
+    <w:p>
+      <w:pPr>
+        <w:jc w:val="center"/>
+      </w:pPr>
+      <w:r>
+        <w:rPr>
+          <w:b w:val="0"/>
+          <w:sz w:val="18"/>
+        </w:rPr>
+        <w:t>Figura 8. Espera en cola de cada cliente según su orden de llegada; la línea punteada es W</w:t>
+      </w:r>
+      <w:r>
+        <w:rPr>
+          <w:b w:val="0"/>
+          <w:sz w:val="18"/>
+          <w:vertAlign w:val="subscript"/>
+        </w:rPr>
+        <w:t>q</w:t>
+      </w:r>
+      <w:r>
+        <w:rPr>
+          <w:b w:val="0"/>
+          <w:sz w:val="18"/>
+        </w:rPr>
+        <w:t xml:space="preserve"> teórico.</w:t>
+      </w:r>
+    </w:p>
+    <w:p>
+      <w:pPr>
+        <w:jc w:val="both"/>
+      </w:pPr>
+      <w:r>
+        <w:rPr>
+          <w:b w:val="0"/>
+        </w:rPr>
+        <w:t>La Figura 8 muestra la espera de cada cliente en el orden en que llegó. En el escenario 1 las esperas no pasan de 7.7 minutos y los picos son aislados; en el escenario 2 llegan a 18.8 minutos. En el escenario 3 las esperas forman rachas largas que llegan a 45.8 minutos, y hasta 2 636 clientes seguidos esperan más que W</w:t>
+      </w:r>
+      <w:r>
+        <w:rPr>
+          <w:b w:val="0"/>
+          <w:vertAlign w:val="subscript"/>
+        </w:rPr>
+        <w:t>q</w:t>
+      </w:r>
+      <w:r>
+        <w:rPr>
+          <w:b w:val="0"/>
+        </w:rPr>
+        <w:t>. Esas rachas son la razón por la que el promedio de la Figura 5 tarda tanto en converger.</w:t>
+      </w:r>
+    </w:p>
+    <w:p>
+      <w:pPr>
         <w:jc w:val="both"/>
       </w:pPr>
       <w:r>

</xml_diff>

<commit_message>
docs(ape-3): sync the final group report and two-row comparison chart
</commit_message>
<xml_diff>
--- a/unidad-1/ape-3-mm1/documento/APE3.docx
+++ b/unidad-1/ape-3-mm1/documento/APE3.docx
@@ -260,7 +260,7 @@
                 <w:b w:val="0"/>
                 <w:sz w:val="19"/>
               </w:rPr>
-              <w:t>1</w:t>
+              <w:t>U1: Introducción a la Simulación</w:t>
             </w:r>
           </w:p>
         </w:tc>
@@ -1630,17 +1630,6 @@
     </w:p>
     <w:p>
       <w:pPr>
-        <w:jc w:val="both"/>
-      </w:pPr>
-      <w:r>
-        <w:rPr>
-          <w:b w:val="0"/>
-        </w:rPr>
-        <w:t>La Tabla 2 resume la corrida de 20 000 minutos con semilla 42 de cada escenario. Entre paréntesis se indica el error relativo, calculado como |simulado − teórico| / teórico.</w:t>
-      </w:r>
-    </w:p>
-    <w:p>
-      <w:pPr>
         <w:keepNext/>
         <w:jc w:val="center"/>
       </w:pPr>
@@ -1649,7 +1638,7 @@
           <w:b w:val="0"/>
           <w:sz w:val="18"/>
         </w:rPr>
-        <w:t>Tabla 2. Valores teóricos / simulados y error relativo por escenario.</w:t>
+        <w:t>Tabla 2. Resultados teóricos y simulados (20 000 minutos simulados, semilla 42).</w:t>
       </w:r>
     </w:p>
     <w:tbl>
@@ -1668,15 +1657,15 @@
         </w:tblBorders>
       </w:tblPr>
       <w:tblGrid>
-        <w:gridCol w:w="1587"/>
-        <w:gridCol w:w="2494"/>
-        <w:gridCol w:w="2494"/>
-        <w:gridCol w:w="2494"/>
+        <w:gridCol w:w="3288"/>
+        <w:gridCol w:w="1928"/>
+        <w:gridCol w:w="1928"/>
+        <w:gridCol w:w="1928"/>
       </w:tblGrid>
       <w:tr>
         <w:tc>
           <w:tcPr>
-            <w:tcW w:type="dxa" w:w="1587"/>
+            <w:tcW w:type="dxa" w:w="3288"/>
           </w:tcPr>
           <w:p>
             <w:pPr>
@@ -1695,7 +1684,7 @@
         </w:tc>
         <w:tc>
           <w:tcPr>
-            <w:tcW w:type="dxa" w:w="2494"/>
+            <w:tcW w:type="dxa" w:w="1928"/>
           </w:tcPr>
           <w:p>
             <w:pPr>
@@ -1709,13 +1698,13 @@
                 <w:b/>
                 <w:sz w:val="19"/>
               </w:rPr>
-              <w:t>Escenario 1 (ρ = 0.667)</w:t>
+              <w:t>Sistema estable</w:t>
             </w:r>
           </w:p>
         </w:tc>
         <w:tc>
           <w:tcPr>
-            <w:tcW w:type="dxa" w:w="2494"/>
+            <w:tcW w:type="dxa" w:w="1928"/>
           </w:tcPr>
           <w:p>
             <w:pPr>
@@ -1729,13 +1718,13 @@
                 <w:b/>
                 <w:sz w:val="19"/>
               </w:rPr>
-              <w:t>Escenario 2 (ρ = 0.833)</w:t>
+              <w:t>Mayor utilización</w:t>
             </w:r>
           </w:p>
         </w:tc>
         <w:tc>
           <w:tcPr>
-            <w:tcW w:type="dxa" w:w="2494"/>
+            <w:tcW w:type="dxa" w:w="1928"/>
           </w:tcPr>
           <w:p>
             <w:pPr>
@@ -1749,7 +1738,7 @@
                 <w:b/>
                 <w:sz w:val="19"/>
               </w:rPr>
-              <w:t>Escenario 3 (ρ = 0.967)</w:t>
+              <w:t>Cerca de saturación</w:t>
             </w:r>
           </w:p>
         </w:tc>
@@ -1757,7 +1746,7 @@
       <w:tr>
         <w:tc>
           <w:tcPr>
-            <w:tcW w:type="dxa" w:w="1587"/>
+            <w:tcW w:type="dxa" w:w="3288"/>
           </w:tcPr>
           <w:p>
             <w:pPr>
@@ -1770,13 +1759,13 @@
                 <w:b/>
                 <w:sz w:val="19"/>
               </w:rPr>
-              <w:t>ρ</w:t>
+              <w:t>ρ teórico / simulado</w:t>
             </w:r>
           </w:p>
         </w:tc>
         <w:tc>
           <w:tcPr>
-            <w:tcW w:type="dxa" w:w="2494"/>
+            <w:tcW w:type="dxa" w:w="1928"/>
           </w:tcPr>
           <w:p>
             <w:pPr>
@@ -1790,13 +1779,13 @@
                 <w:b w:val="0"/>
                 <w:sz w:val="19"/>
               </w:rPr>
-              <w:t>0.667 / 0.670 (0.5 %)</w:t>
+              <w:t>0.667 / 0.670</w:t>
             </w:r>
           </w:p>
         </w:tc>
         <w:tc>
           <w:tcPr>
-            <w:tcW w:type="dxa" w:w="2494"/>
+            <w:tcW w:type="dxa" w:w="1928"/>
           </w:tcPr>
           <w:p>
             <w:pPr>
@@ -1810,13 +1799,13 @@
                 <w:b w:val="0"/>
                 <w:sz w:val="19"/>
               </w:rPr>
-              <w:t>0.833 / 0.835 (0.2 %)</w:t>
+              <w:t>0.833 / 0.835</w:t>
             </w:r>
           </w:p>
         </w:tc>
         <w:tc>
           <w:tcPr>
-            <w:tcW w:type="dxa" w:w="2494"/>
+            <w:tcW w:type="dxa" w:w="1928"/>
           </w:tcPr>
           <w:p>
             <w:pPr>
@@ -1830,7 +1819,7 @@
                 <w:b w:val="0"/>
                 <w:sz w:val="19"/>
               </w:rPr>
-              <w:t>0.967 / 0.968 (0.2 %)</w:t>
+              <w:t>0.967 / 0.968</w:t>
             </w:r>
           </w:p>
         </w:tc>
@@ -1838,7 +1827,7 @@
       <w:tr>
         <w:tc>
           <w:tcPr>
-            <w:tcW w:type="dxa" w:w="1587"/>
+            <w:tcW w:type="dxa" w:w="3288"/>
           </w:tcPr>
           <w:p>
             <w:pPr>
@@ -1851,13 +1840,13 @@
                 <w:b/>
                 <w:sz w:val="19"/>
               </w:rPr>
-              <w:t>L</w:t>
+              <w:t>L teórico / simulado</w:t>
             </w:r>
           </w:p>
         </w:tc>
         <w:tc>
           <w:tcPr>
-            <w:tcW w:type="dxa" w:w="2494"/>
+            <w:tcW w:type="dxa" w:w="1928"/>
           </w:tcPr>
           <w:p>
             <w:pPr>
@@ -1871,13 +1860,13 @@
                 <w:b w:val="0"/>
                 <w:sz w:val="19"/>
               </w:rPr>
-              <w:t>2.000 / 2.036 (1.8 %)</w:t>
+              <w:t>2.000 / 2.036</w:t>
             </w:r>
           </w:p>
         </w:tc>
         <w:tc>
           <w:tcPr>
-            <w:tcW w:type="dxa" w:w="2494"/>
+            <w:tcW w:type="dxa" w:w="1928"/>
           </w:tcPr>
           <w:p>
             <w:pPr>
@@ -1891,13 +1880,13 @@
                 <w:b w:val="0"/>
                 <w:sz w:val="19"/>
               </w:rPr>
-              <w:t>5.000 / 5.029 (0.6 %)</w:t>
+              <w:t>5.000 / 5.029</w:t>
             </w:r>
           </w:p>
         </w:tc>
         <w:tc>
           <w:tcPr>
-            <w:tcW w:type="dxa" w:w="2494"/>
+            <w:tcW w:type="dxa" w:w="1928"/>
           </w:tcPr>
           <w:p>
             <w:pPr>
@@ -1911,7 +1900,7 @@
                 <w:b w:val="0"/>
                 <w:sz w:val="19"/>
               </w:rPr>
-              <w:t>29.000 / 26.592 (8.3 %)</w:t>
+              <w:t>29.000 / 26.592</w:t>
             </w:r>
           </w:p>
         </w:tc>
@@ -1919,7 +1908,7 @@
       <w:tr>
         <w:tc>
           <w:tcPr>
-            <w:tcW w:type="dxa" w:w="1587"/>
+            <w:tcW w:type="dxa" w:w="3288"/>
           </w:tcPr>
           <w:p>
             <w:pPr>
@@ -1942,11 +1931,18 @@
               </w:rPr>
               <w:t>q</w:t>
             </w:r>
+            <w:r>
+              <w:rPr>
+                <w:b/>
+                <w:sz w:val="19"/>
+              </w:rPr>
+              <w:t xml:space="preserve"> teórico / simulado</w:t>
+            </w:r>
           </w:p>
         </w:tc>
         <w:tc>
           <w:tcPr>
-            <w:tcW w:type="dxa" w:w="2494"/>
+            <w:tcW w:type="dxa" w:w="1928"/>
           </w:tcPr>
           <w:p>
             <w:pPr>
@@ -1960,13 +1956,13 @@
                 <w:b w:val="0"/>
                 <w:sz w:val="19"/>
               </w:rPr>
-              <w:t>1.333 / 1.366 (2.5 %)</w:t>
+              <w:t>1.333 / 1.366</w:t>
             </w:r>
           </w:p>
         </w:tc>
         <w:tc>
           <w:tcPr>
-            <w:tcW w:type="dxa" w:w="2494"/>
+            <w:tcW w:type="dxa" w:w="1928"/>
           </w:tcPr>
           <w:p>
             <w:pPr>
@@ -1980,13 +1976,13 @@
                 <w:b w:val="0"/>
                 <w:sz w:val="19"/>
               </w:rPr>
-              <w:t>4.167 / 4.193 (0.6 %)</w:t>
+              <w:t>4.167 / 4.193</w:t>
             </w:r>
           </w:p>
         </w:tc>
         <w:tc>
           <w:tcPr>
-            <w:tcW w:type="dxa" w:w="2494"/>
+            <w:tcW w:type="dxa" w:w="1928"/>
           </w:tcPr>
           <w:p>
             <w:pPr>
@@ -2000,7 +1996,7 @@
                 <w:b w:val="0"/>
                 <w:sz w:val="19"/>
               </w:rPr>
-              <w:t>28.033 / 25.624 (8.6 %)</w:t>
+              <w:t>28.033 / 25.624</w:t>
             </w:r>
           </w:p>
         </w:tc>
@@ -2008,7 +2004,7 @@
       <w:tr>
         <w:tc>
           <w:tcPr>
-            <w:tcW w:type="dxa" w:w="1587"/>
+            <w:tcW w:type="dxa" w:w="3288"/>
           </w:tcPr>
           <w:p>
             <w:pPr>
@@ -2021,13 +2017,13 @@
                 <w:b/>
                 <w:sz w:val="19"/>
               </w:rPr>
-              <w:t>W (min)</w:t>
+              <w:t>W teórico / simulado (min)</w:t>
             </w:r>
           </w:p>
         </w:tc>
         <w:tc>
           <w:tcPr>
-            <w:tcW w:type="dxa" w:w="2494"/>
+            <w:tcW w:type="dxa" w:w="1928"/>
           </w:tcPr>
           <w:p>
             <w:pPr>
@@ -2041,13 +2037,13 @@
                 <w:b w:val="0"/>
                 <w:sz w:val="19"/>
               </w:rPr>
-              <w:t>1.000 / 1.022 (2.2 %)</w:t>
+              <w:t>1.000 / 1.022</w:t>
             </w:r>
           </w:p>
         </w:tc>
         <w:tc>
           <w:tcPr>
-            <w:tcW w:type="dxa" w:w="2494"/>
+            <w:tcW w:type="dxa" w:w="1928"/>
           </w:tcPr>
           <w:p>
             <w:pPr>
@@ -2061,13 +2057,13 @@
                 <w:b w:val="0"/>
                 <w:sz w:val="19"/>
               </w:rPr>
-              <w:t>2.000 / 2.016 (0.8 %)</w:t>
+              <w:t>2.000 / 2.016</w:t>
             </w:r>
           </w:p>
         </w:tc>
         <w:tc>
           <w:tcPr>
-            <w:tcW w:type="dxa" w:w="2494"/>
+            <w:tcW w:type="dxa" w:w="1928"/>
           </w:tcPr>
           <w:p>
             <w:pPr>
@@ -2081,7 +2077,7 @@
                 <w:b w:val="0"/>
                 <w:sz w:val="19"/>
               </w:rPr>
-              <w:t>10.000 / 9.183 (8.2 %)</w:t>
+              <w:t>10.000 / 9.183</w:t>
             </w:r>
           </w:p>
         </w:tc>
@@ -2089,11 +2085,11 @@
       <w:tr>
         <w:tc>
           <w:tcPr>
-            <w:tcW w:type="dxa" w:w="1587"/>
+            <w:tcW w:type="dxa" w:w="3288"/>
           </w:tcPr>
           <w:p>
             <w:pPr>
-              <w:keepNext w:val="0"/>
+              <w:keepNext/>
               <w:spacing w:before="40" w:after="40" w:line="240" w:lineRule="auto"/>
             </w:pPr>
             <w:r/>
@@ -2117,13 +2113,94 @@
                 <w:b/>
                 <w:sz w:val="19"/>
               </w:rPr>
-              <w:t xml:space="preserve"> (min)</w:t>
+              <w:t xml:space="preserve"> teórico / simulado (min)</w:t>
             </w:r>
           </w:p>
         </w:tc>
         <w:tc>
           <w:tcPr>
-            <w:tcW w:type="dxa" w:w="2494"/>
+            <w:tcW w:type="dxa" w:w="1928"/>
+          </w:tcPr>
+          <w:p>
+            <w:pPr>
+              <w:keepNext/>
+              <w:spacing w:before="40" w:after="40" w:line="240" w:lineRule="auto"/>
+              <w:jc w:val="center"/>
+            </w:pPr>
+            <w:r/>
+            <w:r>
+              <w:rPr>
+                <w:b w:val="0"/>
+                <w:sz w:val="19"/>
+              </w:rPr>
+              <w:t>0.667 / 0.685</w:t>
+            </w:r>
+          </w:p>
+        </w:tc>
+        <w:tc>
+          <w:tcPr>
+            <w:tcW w:type="dxa" w:w="1928"/>
+          </w:tcPr>
+          <w:p>
+            <w:pPr>
+              <w:keepNext/>
+              <w:spacing w:before="40" w:after="40" w:line="240" w:lineRule="auto"/>
+              <w:jc w:val="center"/>
+            </w:pPr>
+            <w:r/>
+            <w:r>
+              <w:rPr>
+                <w:b w:val="0"/>
+                <w:sz w:val="19"/>
+              </w:rPr>
+              <w:t>1.667 / 1.681</w:t>
+            </w:r>
+          </w:p>
+        </w:tc>
+        <w:tc>
+          <w:tcPr>
+            <w:tcW w:type="dxa" w:w="1928"/>
+          </w:tcPr>
+          <w:p>
+            <w:pPr>
+              <w:keepNext/>
+              <w:spacing w:before="40" w:after="40" w:line="240" w:lineRule="auto"/>
+              <w:jc w:val="center"/>
+            </w:pPr>
+            <w:r/>
+            <w:r>
+              <w:rPr>
+                <w:b w:val="0"/>
+                <w:sz w:val="19"/>
+              </w:rPr>
+              <w:t>9.667 / 8.849</w:t>
+            </w:r>
+          </w:p>
+        </w:tc>
+      </w:tr>
+      <w:tr>
+        <w:tc>
+          <w:tcPr>
+            <w:tcW w:type="dxa" w:w="3288"/>
+          </w:tcPr>
+          <w:p>
+            <w:pPr>
+              <w:keepNext w:val="0"/>
+              <w:spacing w:before="40" w:after="40" w:line="240" w:lineRule="auto"/>
+            </w:pPr>
+            <w:r/>
+            <w:r>
+              <w:rPr>
+                <w:b/>
+                <w:sz w:val="19"/>
+              </w:rPr>
+              <w:t>Error máximo</w:t>
+            </w:r>
+          </w:p>
+        </w:tc>
+        <w:tc>
+          <w:tcPr>
+            <w:tcW w:type="dxa" w:w="1928"/>
           </w:tcPr>
           <w:p>
             <w:pPr>
@@ -2137,13 +2214,13 @@
                 <w:b w:val="0"/>
                 <w:sz w:val="19"/>
               </w:rPr>
-              <w:t>0.667 / 0.685 (2.8 %)</w:t>
+              <w:t>2.8 %</w:t>
             </w:r>
           </w:p>
         </w:tc>
         <w:tc>
           <w:tcPr>
-            <w:tcW w:type="dxa" w:w="2494"/>
+            <w:tcW w:type="dxa" w:w="1928"/>
           </w:tcPr>
           <w:p>
             <w:pPr>
@@ -2157,13 +2234,13 @@
                 <w:b w:val="0"/>
                 <w:sz w:val="19"/>
               </w:rPr>
-              <w:t>1.667 / 1.681 (0.9 %)</w:t>
+              <w:t>0.9 %</w:t>
             </w:r>
           </w:p>
         </w:tc>
         <w:tc>
           <w:tcPr>
-            <w:tcW w:type="dxa" w:w="2494"/>
+            <w:tcW w:type="dxa" w:w="1928"/>
           </w:tcPr>
           <w:p>
             <w:pPr>
@@ -2177,17 +2254,13 @@
                 <w:b w:val="0"/>
                 <w:sz w:val="19"/>
               </w:rPr>
-              <w:t>9.667 / 8.849 (8.5 %)</w:t>
+              <w:t>8.6 %</w:t>
             </w:r>
           </w:p>
         </w:tc>
       </w:tr>
     </w:tbl>
-    <w:p>
-      <w:pPr>
-        <w:spacing w:after="0"/>
-      </w:pPr>
-    </w:p>
+    <w:p/>
     <w:p>
       <w:pPr>
         <w:keepNext/>
@@ -2196,7 +2269,7 @@
       <w:r>
         <w:drawing>
           <wp:inline xmlns:a="http://schemas.openxmlformats.org/drawingml/2006/main" xmlns:pic="http://schemas.openxmlformats.org/drawingml/2006/picture">
-            <wp:extent cx="5760000" cy="1440000"/>
+            <wp:extent cx="4860000" cy="2871818"/>
             <wp:docPr id="4" name="Picture 4"/>
             <wp:cNvGraphicFramePr>
               <a:graphicFrameLocks noChangeAspect="1"/>
@@ -2217,7 +2290,7 @@
                   <pic:spPr>
                     <a:xfrm>
                       <a:off x="0" y="0"/>
-                      <a:ext cx="5760000" cy="1440000"/>
+                      <a:ext cx="4860000" cy="2871818"/>
                     </a:xfrm>
                     <a:prstGeom prst="rect"/>
                   </pic:spPr>
@@ -2237,7 +2310,7 @@
           <w:b w:val="0"/>
           <w:sz w:val="18"/>
         </w:rPr>
-        <w:t>Figura 4. Métricas teóricas y simuladas por escenario.</w:t>
+        <w:t>Figura 4. Comparación de las métricas teóricas y simuladas por escenario.</w:t>
       </w:r>
     </w:p>
     <w:p>
@@ -2248,7 +2321,7 @@
         <w:rPr>
           <w:b w:val="0"/>
         </w:rPr>
-        <w:t>De la Tabla 2 y la Figura 4 se desprenden tres observaciones:</w:t>
+        <w:t>La comparación demuestra que la simulación sigue la misma tendencia que la teoría: a mayor utilización del servidor, aumentan los tiempos de espera y el número de clientes en el sistema.</w:t>
       </w:r>
     </w:p>
     <w:p>
@@ -2261,13 +2334,26 @@
         <w:rPr>
           <w:b/>
         </w:rPr>
-        <w:t>La utilización es la métrica más precisa</w:t>
+        <w:t>Sistema estable:</w:t>
       </w:r>
       <w:r>
         <w:rPr>
           <w:b w:val="0"/>
         </w:rPr>
-        <w:t xml:space="preserve"> en los tres escenarios (error de 0.5 % o menos), porque solo mide la fracción de tiempo en que la caja está ocupada y se estabiliza pronto.</w:t>
+        <w:t xml:space="preserve"> los valores simulados quedan muy cerca de los teóricos, con un error máximo de 2.8 % (W</w:t>
+      </w:r>
+      <w:r>
+        <w:rPr>
+          <w:b w:val="0"/>
+          <w:vertAlign w:val="subscript"/>
+        </w:rPr>
+        <w:t>q</w:t>
+      </w:r>
+      <w:r>
+        <w:rPr>
+          <w:b w:val="0"/>
+        </w:rPr>
+        <w:t>: 0.667 frente a 0.685).</w:t>
       </w:r>
     </w:p>
     <w:p>
@@ -2280,13 +2366,13 @@
         <w:rPr>
           <w:b/>
         </w:rPr>
-        <w:t>En los escenarios 1 y 2 la simulación reproduce la teoría</w:t>
+        <w:t>Mayor utilización:</w:t>
       </w:r>
       <w:r>
         <w:rPr>
           <w:b w:val="0"/>
         </w:rPr>
-        <w:t>, con errores entre 0.6 % y 2.8 % en las métricas de la cola. Esto valida tanto el modelo como su implementación.</w:t>
+        <w:t xml:space="preserve"> la coincidencia es todavía mayor, con errores menores al 1 % en todas las métricas.</w:t>
       </w:r>
     </w:p>
     <w:p>
@@ -2299,13 +2385,37 @@
         <w:rPr>
           <w:b/>
         </w:rPr>
-        <w:t>En el escenario 3 las métricas de la cola se alejan entre 8.2 % y 8.6 %</w:t>
+        <w:t>Cerca de la saturación:</w:t>
       </w:r>
       <w:r>
         <w:rPr>
           <w:b w:val="0"/>
         </w:rPr>
-        <w:t>, por encima del 5 % que la clase propone como criterio de validación. No se trata de un error del código, sino de que el promedio simulado todavía no se estabiliza, como muestra la Figura 5; para cumplir el criterio habría que usar varias réplicas y descartar el periodo de calentamiento.</w:t>
+        <w:t xml:space="preserve"> la diferencia crece hasta 8.6 % (L</w:t>
+      </w:r>
+      <w:r>
+        <w:rPr>
+          <w:b w:val="0"/>
+          <w:vertAlign w:val="subscript"/>
+        </w:rPr>
+        <w:t>q</w:t>
+      </w:r>
+      <w:r>
+        <w:rPr>
+          <w:b w:val="0"/>
+        </w:rPr>
+        <w:t>: 28.033 frente a 25.624). Con ρ = 0.967 la cola oscila mucho y tarda en alcanzar el estado estable, por lo que ni siquiera 20 000 minutos bastan para que el promedio simulado converja al valor teórico.</w:t>
+      </w:r>
+    </w:p>
+    <w:p>
+      <w:pPr>
+        <w:jc w:val="both"/>
+      </w:pPr>
+      <w:r>
+        <w:rPr>
+          <w:b w:val="0"/>
+        </w:rPr>
+        <w:t>En resumen, la simulación muestra cómo se comporta el sistema en el tiempo, mientras que los resultados teóricos actúan como una base matemática de referencia. Las diferencias se deben a la aleatoriedad y a la duración finita de la simulación, y aumentan cerca de la saturación.</w:t>
       </w:r>
     </w:p>
     <w:p>
@@ -2316,8 +2426,8 @@
       <w:r>
         <w:drawing>
           <wp:inline xmlns:a="http://schemas.openxmlformats.org/drawingml/2006/main" xmlns:pic="http://schemas.openxmlformats.org/drawingml/2006/picture">
-            <wp:extent cx="5760000" cy="2618182"/>
-            <wp:docPr id="5" name="Picture 5"/>
+            <wp:extent cx="5400000" cy="2454545"/>
+            <wp:docPr id="6" name="Picture 6"/>
             <wp:cNvGraphicFramePr>
               <a:graphicFrameLocks noChangeAspect="1"/>
             </wp:cNvGraphicFramePr>
@@ -2329,7 +2439,7 @@
                     <pic:cNvPicPr/>
                   </pic:nvPicPr>
                   <pic:blipFill>
-                    <a:blip r:embed="rId14"/>
+                    <a:blip r:embed="rId15"/>
                     <a:stretch>
                       <a:fillRect/>
                     </a:stretch>
@@ -2337,7 +2447,7 @@
                   <pic:spPr>
                     <a:xfrm>
                       <a:off x="0" y="0"/>
-                      <a:ext cx="5760000" cy="2618182"/>
+                      <a:ext cx="5400000" cy="2454545"/>
                     </a:xfrm>
                     <a:prstGeom prst="rect"/>
                   </pic:spPr>
@@ -2357,7 +2467,29 @@
           <w:b w:val="0"/>
           <w:sz w:val="18"/>
         </w:rPr>
-        <w:t>Figura 5. Promedio acumulado de la espera en cola frente al número de clientes atendidos.</w:t>
+        <w:t xml:space="preserve">Figura 5. Promedio acumulado de la espera en cola frente al número de clientes atendidos; las líneas punteadas son </w:t>
+      </w:r>
+      <w:r>
+        <w:rPr>
+          <w:b w:val="0"/>
+          <w:sz w:val="18"/>
+        </w:rPr>
+        <w:t>W</w:t>
+      </w:r>
+      <w:r>
+        <w:rPr>
+          <w:b w:val="0"/>
+          <w:sz w:val="18"/>
+          <w:vertAlign w:val="subscript"/>
+        </w:rPr>
+        <w:t>q</w:t>
+      </w:r>
+      <w:r>
+        <w:rPr>
+          <w:b w:val="0"/>
+          <w:sz w:val="18"/>
+        </w:rPr>
+        <w:t xml:space="preserve"> teórico.</w:t>
       </w:r>
     </w:p>
     <w:p>
@@ -2368,7 +2500,13 @@
         <w:rPr>
           <w:b w:val="0"/>
         </w:rPr>
-        <w:t>La Figura 5 muestra cómo evoluciona el promedio de la espera en cola a medida que se atienden clientes. En los escenarios 1 y 2 la curva se acerca a W</w:t>
+        <w:t xml:space="preserve">La Figura 5 muestra cómo evoluciona el promedio de la espera en cola a medida que se atienden clientes. Al inicio el promedio oscila mucho porque se calcula con pocos clientes; por la ley de los grandes números, con más clientes se acerca al valor teórico. En los escenarios 1 y 2 la curva llega a </w:t>
+      </w:r>
+      <w:r>
+        <w:rPr>
+          <w:b w:val="0"/>
+        </w:rPr>
+        <w:t>W</w:t>
       </w:r>
       <w:r>
         <w:rPr>
@@ -2381,18 +2519,7 @@
         <w:rPr>
           <w:b w:val="0"/>
         </w:rPr>
-        <w:t xml:space="preserve"> después de unos pocos miles de clientes y ya no se separa. En el escenario 3, en cambio, sube hasta cerca de 17 minutos y después de casi 58 000 clientes todavía cruza el valor teórico de 9.67 minutos: cerca de la saturación, la simulación necesita muchísimo más tiempo para estabilizarse.</w:t>
-      </w:r>
-    </w:p>
-    <w:p>
-      <w:pPr>
-        <w:jc w:val="both"/>
-      </w:pPr>
-      <w:r>
-        <w:rPr>
-          <w:b w:val="0"/>
-        </w:rPr>
-        <w:t>Como verificación interna, los resultados simulados cumplen la ley de Little: λ · W da 2.044, 5.040 y 26.631 clientes, frente a un L simulado de 2.036, 5.029 y 26.592. La diferencia es menor al 0.5 % en los tres escenarios, lo que indica que el modelo registra de forma coherente las llegadas, las esperas y las salidas de los clientes.</w:t>
+        <w:t xml:space="preserve"> después de unos pocos miles de clientes y ya no se separa. En el escenario 3, en cambio, sube hasta cerca de 17 minutos y después de casi 58 000 clientes todavía termina en 8.85 minutos, por debajo de los 9.67 teóricos: cerca de la saturación, la simulación necesita muchísimo más tiempo para estabilizarse. Esto explica la diferencia de 8.6 % de la Tabla 2.</w:t>
       </w:r>
     </w:p>
     <w:p>
@@ -2415,8 +2542,8 @@
       <w:r>
         <w:drawing>
           <wp:inline xmlns:a="http://schemas.openxmlformats.org/drawingml/2006/main" xmlns:pic="http://schemas.openxmlformats.org/drawingml/2006/picture">
-            <wp:extent cx="5040000" cy="3848727"/>
-            <wp:docPr id="6" name="Picture 6"/>
+            <wp:extent cx="3960000" cy="3024000"/>
+            <wp:docPr id="7" name="Picture 7"/>
             <wp:cNvGraphicFramePr>
               <a:graphicFrameLocks noChangeAspect="1"/>
             </wp:cNvGraphicFramePr>
@@ -2428,7 +2555,7 @@
                     <pic:cNvPicPr/>
                   </pic:nvPicPr>
                   <pic:blipFill>
-                    <a:blip r:embed="rId15"/>
+                    <a:blip r:embed="rId16"/>
                     <a:stretch>
                       <a:fillRect/>
                     </a:stretch>
@@ -2436,7 +2563,7 @@
                   <pic:spPr>
                     <a:xfrm>
                       <a:off x="0" y="0"/>
-                      <a:ext cx="5040000" cy="3848727"/>
+                      <a:ext cx="3960000" cy="3024000"/>
                     </a:xfrm>
                     <a:prstGeom prst="rect"/>
                   </pic:spPr>
@@ -2456,7 +2583,59 @@
           <w:b w:val="0"/>
           <w:sz w:val="18"/>
         </w:rPr>
-        <w:t>Figura 6. Tamaño de la cola durante una jornada de 8 horas en cada escenario.</w:t>
+        <w:t xml:space="preserve">Figura 6. Tamaño de la cola durante una jornada de 8 horas en cada escenario; la línea punteada es </w:t>
+      </w:r>
+      <w:r>
+        <w:rPr>
+          <w:b w:val="0"/>
+          <w:sz w:val="18"/>
+        </w:rPr>
+        <w:t>L</w:t>
+      </w:r>
+      <w:r>
+        <w:rPr>
+          <w:b w:val="0"/>
+          <w:sz w:val="18"/>
+          <w:vertAlign w:val="subscript"/>
+        </w:rPr>
+        <w:t>q</w:t>
+      </w:r>
+      <w:r>
+        <w:rPr>
+          <w:b w:val="0"/>
+          <w:sz w:val="18"/>
+        </w:rPr>
+        <w:t xml:space="preserve"> teórico.</w:t>
+      </w:r>
+    </w:p>
+    <w:p>
+      <w:pPr>
+        <w:jc w:val="both"/>
+      </w:pPr>
+      <w:r>
+        <w:rPr>
+          <w:b w:val="0"/>
+        </w:rPr>
+        <w:t xml:space="preserve">La Figura 6 muestra la cola minuto a minuto durante las primeras 8 horas. En el escenario 1 la cola vuelve a cero con frecuencia y sus picos, de hasta 20 clientes, desaparecen en pocos minutos; en el escenario 2 los episodios de cola larga duran más y llegan a 29 clientes; en el escenario 3 la cola ya no se vacía con facilidad y la jornada termina con 69 clientes en espera. </w:t>
+      </w:r>
+      <w:r>
+        <w:rPr>
+          <w:b w:val="0"/>
+        </w:rPr>
+        <w:t>L</w:t>
+      </w:r>
+      <w:r>
+        <w:rPr>
+          <w:b w:val="0"/>
+          <w:vertAlign w:val="subscript"/>
+        </w:rPr>
+        <w:t>q</w:t>
+      </w:r>
+      <w:r>
+        <w:rPr>
+          <w:b w:val="0"/>
+        </w:rPr>
+        <w:t xml:space="preserve"> es un promedio a largo plazo y no un máximo: por la aleatoriedad de las llegadas y de la atención, la cola real sube y baja alrededor de ese valor.</w:t>
       </w:r>
     </w:p>
     <w:p>
@@ -2467,8 +2646,8 @@
       <w:r>
         <w:drawing>
           <wp:inline xmlns:a="http://schemas.openxmlformats.org/drawingml/2006/main" xmlns:pic="http://schemas.openxmlformats.org/drawingml/2006/picture">
-            <wp:extent cx="5760000" cy="1828571"/>
-            <wp:docPr id="7" name="Picture 7"/>
+            <wp:extent cx="4500000" cy="1428571"/>
+            <wp:docPr id="8" name="Picture 8"/>
             <wp:cNvGraphicFramePr>
               <a:graphicFrameLocks noChangeAspect="1"/>
             </wp:cNvGraphicFramePr>
@@ -2480,7 +2659,7 @@
                     <pic:cNvPicPr/>
                   </pic:nvPicPr>
                   <pic:blipFill>
-                    <a:blip r:embed="rId16"/>
+                    <a:blip r:embed="rId17"/>
                     <a:stretch>
                       <a:fillRect/>
                     </a:stretch>
@@ -2488,7 +2667,7 @@
                   <pic:spPr>
                     <a:xfrm>
                       <a:off x="0" y="0"/>
-                      <a:ext cx="5760000" cy="1828571"/>
+                      <a:ext cx="4500000" cy="1428571"/>
                     </a:xfrm>
                     <a:prstGeom prst="rect"/>
                   </pic:spPr>
@@ -2508,64 +2687,59 @@
           <w:b w:val="0"/>
           <w:sz w:val="18"/>
         </w:rPr>
-        <w:t>Figura 7. Distribución de los tiempos de espera en cola de los clientes simulados.</w:t>
+        <w:t xml:space="preserve">Figura 7. Distribución de los tiempos de espera en cola de los clientes simulados; la línea punteada es </w:t>
+      </w:r>
+      <w:r>
+        <w:rPr>
+          <w:b w:val="0"/>
+          <w:sz w:val="18"/>
+        </w:rPr>
+        <w:t>W</w:t>
+      </w:r>
+      <w:r>
+        <w:rPr>
+          <w:b w:val="0"/>
+          <w:sz w:val="18"/>
+          <w:vertAlign w:val="subscript"/>
+        </w:rPr>
+        <w:t>q</w:t>
+      </w:r>
+      <w:r>
+        <w:rPr>
+          <w:b w:val="0"/>
+          <w:sz w:val="18"/>
+        </w:rPr>
+        <w:t xml:space="preserve"> teórico.</w:t>
       </w:r>
     </w:p>
     <w:p>
       <w:pPr>
-        <w:pStyle w:val="ListBullet"/>
-        <w:spacing w:after="60"/>
         <w:jc w:val="both"/>
       </w:pPr>
       <w:r>
         <w:rPr>
-          <w:b/>
+          <w:b w:val="0"/>
         </w:rPr>
-        <w:t>Escenario 1 (ρ = 0.667):</w:t>
+        <w:t xml:space="preserve">La Figura 7 muestra que la mayoría de los clientes espera poco o nada y que unos pocos esperan mucho, lo que forma una cola larga hacia la derecha. Por eso el promedio queda por encima de la espera típica: la mediana es de 0.29, 1.05 y 6.95 minutos, frente a un </w:t>
       </w:r>
       <w:r>
         <w:rPr>
           <w:b w:val="0"/>
         </w:rPr>
-        <w:t xml:space="preserve"> la caja está libre un tercio del tiempo, por lo que uno de cada tres clientes no espera nada. La cola vuelve a cero con frecuencia y sus picos, de hasta 20 clientes en la jornada de la Figura 6, desaparecen en pocos minutos. Aun así, de cada minuto que un cliente pasa en el sistema, 0.667 minutos los pasa esperando.</w:t>
+        <w:t>W</w:t>
       </w:r>
-    </w:p>
-    <w:p>
-      <w:pPr>
-        <w:pStyle w:val="ListBullet"/>
-        <w:spacing w:after="60"/>
-        <w:jc w:val="both"/>
-      </w:pPr>
       <w:r>
         <w:rPr>
-          <w:b/>
+          <w:b w:val="0"/>
+          <w:vertAlign w:val="subscript"/>
         </w:rPr>
-        <w:t>Escenario 2 (ρ = 0.833):</w:t>
+        <w:t>q</w:t>
       </w:r>
       <w:r>
         <w:rPr>
           <w:b w:val="0"/>
         </w:rPr>
-        <w:t xml:space="preserve"> λ aumenta 25 % respecto al escenario 1, pero L se multiplica por 2.5 y W por 2. Con ρ = 0.833 el sistema ya supera el punto de operación seguro de ρ ≤ 0.8: los episodios de cola larga duran más, y la cola llega a 29 clientes durante la jornada.</w:t>
-      </w:r>
-    </w:p>
-    <w:p>
-      <w:pPr>
-        <w:pStyle w:val="ListBullet"/>
-        <w:spacing w:after="60"/>
-        <w:jc w:val="both"/>
-      </w:pPr>
-      <w:r>
-        <w:rPr>
-          <w:b/>
-        </w:rPr>
-        <w:t>Escenario 3 (ρ = 0.967):</w:t>
-      </w:r>
-      <w:r>
-        <w:rPr>
-          <w:b w:val="0"/>
-        </w:rPr>
-        <w:t xml:space="preserve"> λ aumenta 45 % respecto al escenario 1, pero W pasa de 1 a 10 minutos y L de 2 a 29 clientes. La cola ya no se vacía con facilidad: la jornada simulada termina con cerca de 70 clientes en espera, y en la Figura 7 algunos clientes esperan más de 40 minutos. Solo el 3.3 % de los clientes encuentra la caja libre.</w:t>
+        <w:t xml:space="preserve"> de 0.67, 1.67 y 9.67 minutos. La proporción de clientes que no espera coincide con la teoría del M/M/1, 1 − ρ: 33.1 %, 16.5 % y 3.2 % en la simulación, frente a 33.3 %, 16.7 % y 3.3 %.</w:t>
       </w:r>
     </w:p>
     <w:p>
@@ -2576,8 +2750,8 @@
       <w:r>
         <w:drawing>
           <wp:inline xmlns:a="http://schemas.openxmlformats.org/drawingml/2006/main" xmlns:pic="http://schemas.openxmlformats.org/drawingml/2006/picture">
-            <wp:extent cx="5760000" cy="4398545"/>
-            <wp:docPr id="8" name="Picture 8"/>
+            <wp:extent cx="3780000" cy="2886545"/>
+            <wp:docPr id="5" name="Picture 5"/>
             <wp:cNvGraphicFramePr>
               <a:graphicFrameLocks noChangeAspect="1"/>
             </wp:cNvGraphicFramePr>
@@ -2589,7 +2763,7 @@
                     <pic:cNvPicPr/>
                   </pic:nvPicPr>
                   <pic:blipFill>
-                    <a:blip r:embed="rId17"/>
+                    <a:blip r:embed="rId14"/>
                     <a:stretch>
                       <a:fillRect/>
                     </a:stretch>
@@ -2597,7 +2771,7 @@
                   <pic:spPr>
                     <a:xfrm>
                       <a:off x="0" y="0"/>
-                      <a:ext cx="5760000" cy="4398545"/>
+                      <a:ext cx="3780000" cy="2886545"/>
                     </a:xfrm>
                     <a:prstGeom prst="rect"/>
                   </pic:spPr>
@@ -2643,7 +2817,7 @@
         <w:rPr>
           <w:b w:val="0"/>
         </w:rPr>
-        <w:t>La Figura 8 muestra la espera de cada cliente en el orden en que llegó. En el escenario 1 las esperas no pasan de 7.7 minutos y los picos son aislados; en el escenario 2 llegan a 18.8 minutos. En el escenario 3 las esperas forman rachas largas que llegan a 45.8 minutos, y hasta 2 636 clientes seguidos esperan más que W</w:t>
+        <w:t>En la Figura 8 cada punto es un cliente. En el escenario 1 las esperas no pasan de 7.7 minutos y los picos son aislados; en el escenario 2 llegan a 18.8 minutos. En el escenario 3 las esperas forman rachas largas que llegan a 45.8 minutos: hasta 2 636 clientes seguidos esperan más que W</w:t>
       </w:r>
       <w:r>
         <w:rPr>
@@ -2656,7 +2830,7 @@
         <w:rPr>
           <w:b w:val="0"/>
         </w:rPr>
-        <w:t>. Esas rachas son la razón por la que el promedio de la Figura 5 tarda tanto en converger.</w:t>
+        <w:t>, por lo que el promedio de la Figura 5 tarda mucho en estabilizarse.</w:t>
       </w:r>
     </w:p>
     <w:p>
@@ -2667,7 +2841,7 @@
         <w:rPr>
           <w:b w:val="0"/>
         </w:rPr>
-        <w:t>El crecimiento no es lineal porque W = 1/(μ − λ) depende de la holgura μ − λ, que en los tres escenarios vale 1.0, 0.5 y 0.1 clientes/min. Reducir esa holgura a la décima parte multiplica por diez el tiempo que el cliente pasa en el sistema. Para la caja rápida, esto significa que con ρ cercano a 1 una mejora pequeña no alcanza: habría que abrir una segunda caja o reducir el tiempo de atención.</w:t>
+        <w:t>En el primer escenario el sistema opera de forma estable; en el segundo, el servidor se utiliza más y los clientes esperan más tiempo; y en el tercero, el sistema se acerca a su capacidad, lo que genera un aumento significativo de la cola: L pasa de 2 a 29 clientes y W de 1 a 10 minutos, un crecimiento no lineal frente al aumento de ρ. Esto muestra que mantener un equilibrio entre la tasa de llegada y la tasa de servicio es clave para el buen funcionamiento del sistema M/M/1.</w:t>
       </w:r>
     </w:p>
     <w:p>
@@ -2684,7 +2858,7 @@
         <w:rPr>
           <w:b w:val="0"/>
         </w:rPr>
-        <w:t xml:space="preserve"> https://github.com/AlejandroTatum/simulacion-unl/tree/main/unidad-1/ape-3-mm1</w:t>
+        <w:t xml:space="preserve"> https://github.com/AlejandroTatum/simulacion-ape-3-mm1</w:t>
       </w:r>
     </w:p>
     <w:p>
@@ -2720,7 +2894,7 @@
         <w:rPr>
           <w:b w:val="0"/>
         </w:rPr>
-        <w:t>En la notación de Kendall A/B/c/K/N/D, el M/M/1 corresponde a M/M/1/∞/∞/FIFO: llegadas de Poisson (A = M, de Markov, sin memoria), servicio exponencial (B = M), un solo servidor (c = 1), capacidad ilimitada (K = ∞), población infinita (N = ∞) y disciplina FIFO. Es el caso más simple de la teoría de colas: sus supuestos son restrictivos, pero permiten fórmulas cerradas para todas las métricas. En esta práctica representa la caja rápida de un supermercado con una sola cajera.</w:t>
+        <w:t>Representa un sistema de líneas de espera con llegadas de clientes según una distribución de Poisson, tiempos de servicio con distribución exponencial, un único servidor y atención bajo el principio FIFO (primero en llegar, primero en ser atendido).</w:t>
       </w:r>
     </w:p>
     <w:p>
@@ -2743,7 +2917,7 @@
         <w:rPr>
           <w:b w:val="0"/>
         </w:rPr>
-        <w:t>λ es la tasa de llegada, es decir, los clientes que llegan por unidad de tiempo, y determina la demanda del sistema; μ es la tasa de servicio, los clientes que el servidor atiende por unidad de tiempo, y determina su capacidad. En los escenarios, λ vale 2.0, 2.5 y 2.9 clientes/min y μ = 3.0 clientes/min. Sus inversos son el tiempo medio entre llegadas (E[T] = 1/λ) y el tiempo medio de atención: con μ = 3.0, cada atención dura en promedio 1/3 de minuto (20 segundos).</w:t>
+        <w:t>λ representa la tasa promedio de llegada de clientes, y μ representa la tasa promedio de servicio del servidor.</w:t>
       </w:r>
     </w:p>
     <w:p>
@@ -2766,7 +2940,7 @@
         <w:rPr>
           <w:b w:val="0"/>
         </w:rPr>
-        <w:t>Porque la condición de estabilidad es ρ = λ/μ &lt; 1, que equivale a λ &lt; μ. Si ρ ≥ 1 llegan, en promedio, al menos tantos clientes como los que el servidor puede atender, las colas crecen sin límite y ni las fórmulas del M/M/1 ni la ley de Little son válidas: todas las fórmulas tienen μ − λ en el denominador. Por eso el código rechaza esos casos con un error antes de calcular.</w:t>
+        <w:t>Porque si la tasa de llegada fuera mayor o igual a la tasa de servicio (λ ≥ μ), el servidor no daría abasto para atender a todos los clientes que llegan, provocando que la cola crezca indefinidamente y el sistema no sea estable.</w:t>
       </w:r>
     </w:p>
     <w:p>
@@ -2789,7 +2963,7 @@
         <w:rPr>
           <w:b w:val="0"/>
         </w:rPr>
-        <w:t>ρ = λ/μ es la fracción del tiempo en que el servidor está ocupado, y P₀ = 1 − ρ es la probabilidad de que el sistema esté vacío. En el escenario 1, ρ = 0.667 significa que la caja está ocupada dos tercios del tiempo y libre el tercio restante (P₀ = 0.333); la simulación midió 0.670. Como referencia práctica se recomienda operar con ρ ≤ 0.8, valor que los escenarios 2 y 3 superan.</w:t>
+        <w:t>Representa la utilización del servidor, calculada como ρ = λ/μ, e indica la proporción de tiempo que el servidor se encuentra ocupado atendiendo clientes.</w:t>
       </w:r>
     </w:p>
     <w:p>
@@ -2825,7 +2999,7 @@
         <w:rPr>
           <w:b w:val="0"/>
         </w:rPr>
-        <w:t>W es el tiempo esperado total en el sistema (espera más servicio) y W</w:t>
+        <w:t>W es el tiempo promedio total que un cliente permanece en el sistema (incluyendo el tiempo de espera y el de servicio), mientras que W</w:t>
       </w:r>
       <w:r>
         <w:rPr>
@@ -2838,20 +3012,7 @@
         <w:rPr>
           <w:b w:val="0"/>
         </w:rPr>
-        <w:t xml:space="preserve"> es el tiempo esperado en la cola antes de iniciar el servicio. Se diferencian justamente en el tiempo medio de servicio: W = W</w:t>
-      </w:r>
-      <w:r>
-        <w:rPr>
-          <w:b w:val="0"/>
-          <w:vertAlign w:val="subscript"/>
-        </w:rPr>
-        <w:t>q</w:t>
-      </w:r>
-      <w:r>
-        <w:rPr>
-          <w:b w:val="0"/>
-        </w:rPr>
-        <w:t xml:space="preserve"> + 1/μ. En el escenario 1, 1.000 = 0.667 + 0.333 minutos.</w:t>
+        <w:t xml:space="preserve"> es únicamente el tiempo promedio que un cliente espera en la cola antes de ser atendido.</w:t>
       </w:r>
     </w:p>
     <w:p>
@@ -2887,7 +3048,7 @@
         <w:rPr>
           <w:b w:val="0"/>
         </w:rPr>
-        <w:t>L es el número esperado de clientes en el sistema (cola más servicio) y L</w:t>
+        <w:t>L es el número promedio total de clientes en el sistema (tanto en la cola como siendo atendidos), mientras que L</w:t>
       </w:r>
       <w:r>
         <w:rPr>
@@ -2900,46 +3061,7 @@
         <w:rPr>
           <w:b w:val="0"/>
         </w:rPr>
-        <w:t xml:space="preserve"> el número esperado de clientes que esperan a ser atendidos. Ambas se relacionan con los tiempos por la ley de Little, L = λW y L</w:t>
-      </w:r>
-      <w:r>
-        <w:rPr>
-          <w:b w:val="0"/>
-          <w:vertAlign w:val="subscript"/>
-        </w:rPr>
-        <w:t>q</w:t>
-      </w:r>
-      <w:r>
-        <w:rPr>
-          <w:b w:val="0"/>
-        </w:rPr>
-        <w:t xml:space="preserve"> = λW</w:t>
-      </w:r>
-      <w:r>
-        <w:rPr>
-          <w:b w:val="0"/>
-          <w:vertAlign w:val="subscript"/>
-        </w:rPr>
-        <w:t>q</w:t>
-      </w:r>
-      <w:r>
-        <w:rPr>
-          <w:b w:val="0"/>
-        </w:rPr>
-        <w:t>; en el escenario 1, L = 2.0 · 1.000 = 2.000 y L</w:t>
-      </w:r>
-      <w:r>
-        <w:rPr>
-          <w:b w:val="0"/>
-          <w:vertAlign w:val="subscript"/>
-        </w:rPr>
-        <w:t>q</w:t>
-      </w:r>
-      <w:r>
-        <w:rPr>
-          <w:b w:val="0"/>
-        </w:rPr>
-        <w:t xml:space="preserve"> = 2.0 · 0.667 = 1.333.</w:t>
+        <w:t xml:space="preserve"> es exclusivamente el número promedio de clientes que esperan en la cola.</w:t>
       </w:r>
     </w:p>
     <w:p>
@@ -2962,7 +3084,7 @@
         <w:rPr>
           <w:b w:val="0"/>
         </w:rPr>
-        <w:t>Porque en un proceso de Poisson con tasa λ el tiempo entre eventos sigue una distribución exponencial de media 1/λ (y varianza 1/λ²). Ese proceso supone eventos independientes, una probabilidad de llegada λΔt en un intervalo corto y falta de memoria: el tiempo hasta la próxima llegada no depende del tiempo transcurrido desde la anterior. El servicio del M/M/1 también es exponencial. En el código, los tiempos se generan con la exponencial de NumPy y SimPy avanza el reloj con env.timeout; los histogramas de la ventana en vivo confirman que siguen la curva teórica.</w:t>
+        <w:t>Porque en el modelo M/M/1 las llegadas siguen un proceso de Poisson, sin memoria, lo que matemáticamente equivale a que los tiempos entre llegadas sean exponenciales; el servicio también se modela como exponencial. En el código, SimPy solo maneja el tiempo de los eventos, y los tiempos se generan con la distribución exponencial de NumPy.</w:t>
       </w:r>
     </w:p>
     <w:p>
@@ -2985,7 +3107,7 @@
         <w:rPr>
           <w:b w:val="0"/>
         </w:rPr>
-        <w:t>Ocurre la inestabilidad por congestión: cuando ρ → 1, todas las métricas tienden a infinito, por ejemplo L = ρ/(1 − ρ). Aunque el servidor parezca alcanzar a atender, la varianza de las distribuciones exponenciales provoca momentos en que llegan muchos clientes seguidos y el servidor ya no recupera el retraso. En la práctica se observó en el escenario 3: con ρ = 0.967, L = 29 clientes y W = 10 minutos, frente a 2 clientes y 1 minuto con ρ = 0.667.</w:t>
+        <w:t>Cuando λ se aproxima a μ (es decir, ρ se acerca a 1), aumentan drásticamente el tiempo de espera y el tamaño de la cola, ya que el servidor trabaja cerca de su capacidad máxima.</w:t>
       </w:r>
     </w:p>
     <w:p>
@@ -3008,7 +3130,7 @@
         <w:rPr>
           <w:b w:val="0"/>
         </w:rPr>
-        <w:t>Porque las fórmulas dan valores esperados del estado estable, mientras que la simulación estima promedios a partir de una muestra aleatoria finita. Según el criterio de validación de la clase, los errores deben quedar por debajo del 5 % con 30 réplicas de 10 000 minutos; si no, hay que revisar el periodo de calentamiento (warm-up), el número de réplicas y el cálculo de las áreas. En esta práctica se usó una sola réplica de 20 000 minutos sin eliminar el calentamiento: los escenarios 1 y 2 cumplen el criterio, pero el escenario 3 llega a 8.6 %, porque cerca de ρ = 1 la varianza es mayor.</w:t>
+        <w:t>Porque los resultados teóricos se calculan mediante fórmulas deterministas basadas en el valor esperado a largo plazo, mientras que los resultados simulados dependen de muestras aleatorias generadas durante un tiempo de simulación finito y están sujetos a la variabilidad estocástica.</w:t>
       </w:r>
     </w:p>
     <w:p>
@@ -3031,7 +3153,7 @@
         <w:rPr>
           <w:b w:val="0"/>
         </w:rPr>
-        <w:t>Se tendría ρ &gt; 1 y el sistema sería inestable: las fórmulas del M/M/1 no aplican y la cola crece sin límite, en promedio a razón de λ − μ clientes por unidad de tiempo. Con λ = 3.5 y μ = 3.0, por ejemplo, se acumularían unos 0.5 clientes por minuto, alrededor de 240 al final de una jornada de 8 horas. Solo se puede estabilizar aumentando la capacidad, por ejemplo agregando servidores.</w:t>
+        <w:t>El sistema se volvería inestable: los clientes llegarían a un ritmo más rápido del que el servidor es capaz de atender, haciendo que la cola crezca de forma indefinida.</w:t>
       </w:r>
     </w:p>
     <w:p>
@@ -3057,7 +3179,7 @@
         <w:rPr>
           <w:b w:val="0"/>
         </w:rPr>
-        <w:t>Se implementó el modelo M/M/1 de la caja rápida en SimPy con semilla configurable. Con 20 000 minutos simulados, los resultados coinciden con la teoría con errores menores al 3 % en los escenarios 1 y 2, lo que valida el modelo y su implementación.</w:t>
+        <w:t>La implementación de un modelo M/M/1 en Python mediante SimPy permite mostrar cómo funciona un sistema de colas, tomando en cuenta la llegada de clientes y el servicio proporcionado por un solo servidor.</w:t>
       </w:r>
     </w:p>
     <w:p>
@@ -3070,7 +3192,33 @@
         <w:rPr>
           <w:b w:val="0"/>
         </w:rPr>
-        <w:t>La utilización es la métrica que mejor coincide con la teoría (0.5 % de error o menos), mientras que las métricas de la cola son las más sensibles a la aleatoriedad, en especial cerca de la saturación, donde el error llega a 8.6 %.</w:t>
+        <w:t>Se comprendió la importancia de calcular las métricas L, L</w:t>
+      </w:r>
+      <w:r>
+        <w:rPr>
+          <w:b w:val="0"/>
+          <w:vertAlign w:val="subscript"/>
+        </w:rPr>
+        <w:t>q</w:t>
+      </w:r>
+      <w:r>
+        <w:rPr>
+          <w:b w:val="0"/>
+        </w:rPr>
+        <w:t>, W y W</w:t>
+      </w:r>
+      <w:r>
+        <w:rPr>
+          <w:b w:val="0"/>
+          <w:vertAlign w:val="subscript"/>
+        </w:rPr>
+        <w:t>q</w:t>
+      </w:r>
+      <w:r>
+        <w:rPr>
+          <w:b w:val="0"/>
+        </w:rPr>
+        <w:t>, ya que permiten conocer el número promedio de clientes en el sistema, el tamaño de la fila y los tiempos promedio de espera y de permanencia.</w:t>
       </w:r>
     </w:p>
     <w:p>
@@ -3083,7 +3231,7 @@
         <w:rPr>
           <w:b w:val="0"/>
         </w:rPr>
-        <w:t>El desempeño del sistema depende de la holgura μ − λ y no de λ por sí sola: al pasar de ρ = 0.667 a ρ = 0.967, λ aumenta 45 %, pero el tiempo en el sistema se multiplica por diez.</w:t>
+        <w:t>A medida que la tasa de llegada (λ) se acerca a la tasa de servicio (μ), es decir, cuando ρ se aproxima a 1, los tiempos de espera y el tamaño de la cola aumentan de forma drástica, lo que demuestra que el sistema se satura al trabajar cerca de su capacidad máxima.</w:t>
       </w:r>
     </w:p>
     <w:p>
@@ -3096,7 +3244,7 @@
         <w:rPr>
           <w:b w:val="0"/>
         </w:rPr>
-        <w:t>Cerca de la saturación, la simulación necesita mucho más tiempo para estabilizarse, por lo que la duración de la corrida debe elegirse de acuerdo con ρ antes de comparar con la teoría.</w:t>
+        <w:t>Los resultados simulados se aproximan a los teóricos con errores menores al 3 % en los escenarios estable y de mayor utilización; cerca de la saturación la diferencia llega a 8.6 %, porque las fórmulas representan valores esperados a largo plazo, mientras que la simulación está sujeta a la aleatoriedad y a un tiempo de ejecución finito.</w:t>
       </w:r>
     </w:p>
     <w:p>
@@ -3120,7 +3268,7 @@
         <w:rPr>
           <w:b w:val="0"/>
         </w:rPr>
-        <w:t>En esta práctica utilicé un agente de programación basado en el modelo Claude de Anthropic como herramienta de apoyo para estructurar el código en SimPy, generar las gráficas y la ventana en vivo de Matplotlib, revisar el informe grupal y redactar borradores de esta sección individual. Las decisiones sobre el modelo, los escenarios, la semilla y el formato las tomé junto con el grupo; verifiqué cada resultado ejecutando el código y comparándolo con las fórmulas teóricas, y revisé y ajusté el texto antes de entregarlo.</w:t>
+        <w:t>Para el desarrollo de la presente práctica, el grupo empleó el agente de programación el Gentleman (Pi) con el modelo Claude en la lectura de la guía, la implementación del modelo en SimPy, las fórmulas teóricas, las pruebas, las gráficas, la ventana en vivo y la redacción del informe. La IA ejecutó las tareas; las decisiones de modelo, formato y contenido las tomó el grupo en cada iteración, y los autores revisaron y validaron los resultados, garantizando la coherencia técnica y académica del trabajo presentado.</w:t>
       </w:r>
     </w:p>
     <w:p>

</xml_diff>

<commit_message>
Revert "docs(ape-3): sync the final group report and two-row comparison chart"
This reverts commit 7181efe0c60d4dab66395dd621ffcea6a5525239.
</commit_message>
<xml_diff>
--- a/unidad-1/ape-3-mm1/documento/APE3.docx
+++ b/unidad-1/ape-3-mm1/documento/APE3.docx
@@ -260,7 +260,7 @@
                 <w:b w:val="0"/>
                 <w:sz w:val="19"/>
               </w:rPr>
-              <w:t>U1: Introducción a la Simulación</w:t>
+              <w:t>1</w:t>
             </w:r>
           </w:p>
         </w:tc>
@@ -1630,6 +1630,17 @@
     </w:p>
     <w:p>
       <w:pPr>
+        <w:jc w:val="both"/>
+      </w:pPr>
+      <w:r>
+        <w:rPr>
+          <w:b w:val="0"/>
+        </w:rPr>
+        <w:t>La Tabla 2 resume la corrida de 20 000 minutos con semilla 42 de cada escenario. Entre paréntesis se indica el error relativo, calculado como |simulado − teórico| / teórico.</w:t>
+      </w:r>
+    </w:p>
+    <w:p>
+      <w:pPr>
         <w:keepNext/>
         <w:jc w:val="center"/>
       </w:pPr>
@@ -1638,7 +1649,7 @@
           <w:b w:val="0"/>
           <w:sz w:val="18"/>
         </w:rPr>
-        <w:t>Tabla 2. Resultados teóricos y simulados (20 000 minutos simulados, semilla 42).</w:t>
+        <w:t>Tabla 2. Valores teóricos / simulados y error relativo por escenario.</w:t>
       </w:r>
     </w:p>
     <w:tbl>
@@ -1657,15 +1668,15 @@
         </w:tblBorders>
       </w:tblPr>
       <w:tblGrid>
-        <w:gridCol w:w="3288"/>
-        <w:gridCol w:w="1928"/>
-        <w:gridCol w:w="1928"/>
-        <w:gridCol w:w="1928"/>
+        <w:gridCol w:w="1587"/>
+        <w:gridCol w:w="2494"/>
+        <w:gridCol w:w="2494"/>
+        <w:gridCol w:w="2494"/>
       </w:tblGrid>
       <w:tr>
         <w:tc>
           <w:tcPr>
-            <w:tcW w:type="dxa" w:w="3288"/>
+            <w:tcW w:type="dxa" w:w="1587"/>
           </w:tcPr>
           <w:p>
             <w:pPr>
@@ -1684,7 +1695,7 @@
         </w:tc>
         <w:tc>
           <w:tcPr>
-            <w:tcW w:type="dxa" w:w="1928"/>
+            <w:tcW w:type="dxa" w:w="2494"/>
           </w:tcPr>
           <w:p>
             <w:pPr>
@@ -1698,13 +1709,13 @@
                 <w:b/>
                 <w:sz w:val="19"/>
               </w:rPr>
-              <w:t>Sistema estable</w:t>
+              <w:t>Escenario 1 (ρ = 0.667)</w:t>
             </w:r>
           </w:p>
         </w:tc>
         <w:tc>
           <w:tcPr>
-            <w:tcW w:type="dxa" w:w="1928"/>
+            <w:tcW w:type="dxa" w:w="2494"/>
           </w:tcPr>
           <w:p>
             <w:pPr>
@@ -1718,13 +1729,13 @@
                 <w:b/>
                 <w:sz w:val="19"/>
               </w:rPr>
-              <w:t>Mayor utilización</w:t>
+              <w:t>Escenario 2 (ρ = 0.833)</w:t>
             </w:r>
           </w:p>
         </w:tc>
         <w:tc>
           <w:tcPr>
-            <w:tcW w:type="dxa" w:w="1928"/>
+            <w:tcW w:type="dxa" w:w="2494"/>
           </w:tcPr>
           <w:p>
             <w:pPr>
@@ -1738,7 +1749,7 @@
                 <w:b/>
                 <w:sz w:val="19"/>
               </w:rPr>
-              <w:t>Cerca de saturación</w:t>
+              <w:t>Escenario 3 (ρ = 0.967)</w:t>
             </w:r>
           </w:p>
         </w:tc>
@@ -1746,7 +1757,7 @@
       <w:tr>
         <w:tc>
           <w:tcPr>
-            <w:tcW w:type="dxa" w:w="3288"/>
+            <w:tcW w:type="dxa" w:w="1587"/>
           </w:tcPr>
           <w:p>
             <w:pPr>
@@ -1759,13 +1770,13 @@
                 <w:b/>
                 <w:sz w:val="19"/>
               </w:rPr>
-              <w:t>ρ teórico / simulado</w:t>
+              <w:t>ρ</w:t>
             </w:r>
           </w:p>
         </w:tc>
         <w:tc>
           <w:tcPr>
-            <w:tcW w:type="dxa" w:w="1928"/>
+            <w:tcW w:type="dxa" w:w="2494"/>
           </w:tcPr>
           <w:p>
             <w:pPr>
@@ -1779,13 +1790,13 @@
                 <w:b w:val="0"/>
                 <w:sz w:val="19"/>
               </w:rPr>
-              <w:t>0.667 / 0.670</w:t>
+              <w:t>0.667 / 0.670 (0.5 %)</w:t>
             </w:r>
           </w:p>
         </w:tc>
         <w:tc>
           <w:tcPr>
-            <w:tcW w:type="dxa" w:w="1928"/>
+            <w:tcW w:type="dxa" w:w="2494"/>
           </w:tcPr>
           <w:p>
             <w:pPr>
@@ -1799,13 +1810,13 @@
                 <w:b w:val="0"/>
                 <w:sz w:val="19"/>
               </w:rPr>
-              <w:t>0.833 / 0.835</w:t>
+              <w:t>0.833 / 0.835 (0.2 %)</w:t>
             </w:r>
           </w:p>
         </w:tc>
         <w:tc>
           <w:tcPr>
-            <w:tcW w:type="dxa" w:w="1928"/>
+            <w:tcW w:type="dxa" w:w="2494"/>
           </w:tcPr>
           <w:p>
             <w:pPr>
@@ -1819,7 +1830,7 @@
                 <w:b w:val="0"/>
                 <w:sz w:val="19"/>
               </w:rPr>
-              <w:t>0.967 / 0.968</w:t>
+              <w:t>0.967 / 0.968 (0.2 %)</w:t>
             </w:r>
           </w:p>
         </w:tc>
@@ -1827,7 +1838,7 @@
       <w:tr>
         <w:tc>
           <w:tcPr>
-            <w:tcW w:type="dxa" w:w="3288"/>
+            <w:tcW w:type="dxa" w:w="1587"/>
           </w:tcPr>
           <w:p>
             <w:pPr>
@@ -1840,13 +1851,13 @@
                 <w:b/>
                 <w:sz w:val="19"/>
               </w:rPr>
-              <w:t>L teórico / simulado</w:t>
+              <w:t>L</w:t>
             </w:r>
           </w:p>
         </w:tc>
         <w:tc>
           <w:tcPr>
-            <w:tcW w:type="dxa" w:w="1928"/>
+            <w:tcW w:type="dxa" w:w="2494"/>
           </w:tcPr>
           <w:p>
             <w:pPr>
@@ -1860,13 +1871,13 @@
                 <w:b w:val="0"/>
                 <w:sz w:val="19"/>
               </w:rPr>
-              <w:t>2.000 / 2.036</w:t>
+              <w:t>2.000 / 2.036 (1.8 %)</w:t>
             </w:r>
           </w:p>
         </w:tc>
         <w:tc>
           <w:tcPr>
-            <w:tcW w:type="dxa" w:w="1928"/>
+            <w:tcW w:type="dxa" w:w="2494"/>
           </w:tcPr>
           <w:p>
             <w:pPr>
@@ -1880,13 +1891,13 @@
                 <w:b w:val="0"/>
                 <w:sz w:val="19"/>
               </w:rPr>
-              <w:t>5.000 / 5.029</w:t>
+              <w:t>5.000 / 5.029 (0.6 %)</w:t>
             </w:r>
           </w:p>
         </w:tc>
         <w:tc>
           <w:tcPr>
-            <w:tcW w:type="dxa" w:w="1928"/>
+            <w:tcW w:type="dxa" w:w="2494"/>
           </w:tcPr>
           <w:p>
             <w:pPr>
@@ -1900,7 +1911,7 @@
                 <w:b w:val="0"/>
                 <w:sz w:val="19"/>
               </w:rPr>
-              <w:t>29.000 / 26.592</w:t>
+              <w:t>29.000 / 26.592 (8.3 %)</w:t>
             </w:r>
           </w:p>
         </w:tc>
@@ -1908,7 +1919,7 @@
       <w:tr>
         <w:tc>
           <w:tcPr>
-            <w:tcW w:type="dxa" w:w="3288"/>
+            <w:tcW w:type="dxa" w:w="1587"/>
           </w:tcPr>
           <w:p>
             <w:pPr>
@@ -1931,18 +1942,11 @@
               </w:rPr>
               <w:t>q</w:t>
             </w:r>
-            <w:r>
-              <w:rPr>
-                <w:b/>
-                <w:sz w:val="19"/>
-              </w:rPr>
-              <w:t xml:space="preserve"> teórico / simulado</w:t>
-            </w:r>
           </w:p>
         </w:tc>
         <w:tc>
           <w:tcPr>
-            <w:tcW w:type="dxa" w:w="1928"/>
+            <w:tcW w:type="dxa" w:w="2494"/>
           </w:tcPr>
           <w:p>
             <w:pPr>
@@ -1956,13 +1960,13 @@
                 <w:b w:val="0"/>
                 <w:sz w:val="19"/>
               </w:rPr>
-              <w:t>1.333 / 1.366</w:t>
+              <w:t>1.333 / 1.366 (2.5 %)</w:t>
             </w:r>
           </w:p>
         </w:tc>
         <w:tc>
           <w:tcPr>
-            <w:tcW w:type="dxa" w:w="1928"/>
+            <w:tcW w:type="dxa" w:w="2494"/>
           </w:tcPr>
           <w:p>
             <w:pPr>
@@ -1976,13 +1980,13 @@
                 <w:b w:val="0"/>
                 <w:sz w:val="19"/>
               </w:rPr>
-              <w:t>4.167 / 4.193</w:t>
+              <w:t>4.167 / 4.193 (0.6 %)</w:t>
             </w:r>
           </w:p>
         </w:tc>
         <w:tc>
           <w:tcPr>
-            <w:tcW w:type="dxa" w:w="1928"/>
+            <w:tcW w:type="dxa" w:w="2494"/>
           </w:tcPr>
           <w:p>
             <w:pPr>
@@ -1996,7 +2000,7 @@
                 <w:b w:val="0"/>
                 <w:sz w:val="19"/>
               </w:rPr>
-              <w:t>28.033 / 25.624</w:t>
+              <w:t>28.033 / 25.624 (8.6 %)</w:t>
             </w:r>
           </w:p>
         </w:tc>
@@ -2004,7 +2008,7 @@
       <w:tr>
         <w:tc>
           <w:tcPr>
-            <w:tcW w:type="dxa" w:w="3288"/>
+            <w:tcW w:type="dxa" w:w="1587"/>
           </w:tcPr>
           <w:p>
             <w:pPr>
@@ -2017,13 +2021,13 @@
                 <w:b/>
                 <w:sz w:val="19"/>
               </w:rPr>
-              <w:t>W teórico / simulado (min)</w:t>
+              <w:t>W (min)</w:t>
             </w:r>
           </w:p>
         </w:tc>
         <w:tc>
           <w:tcPr>
-            <w:tcW w:type="dxa" w:w="1928"/>
+            <w:tcW w:type="dxa" w:w="2494"/>
           </w:tcPr>
           <w:p>
             <w:pPr>
@@ -2037,13 +2041,13 @@
                 <w:b w:val="0"/>
                 <w:sz w:val="19"/>
               </w:rPr>
-              <w:t>1.000 / 1.022</w:t>
+              <w:t>1.000 / 1.022 (2.2 %)</w:t>
             </w:r>
           </w:p>
         </w:tc>
         <w:tc>
           <w:tcPr>
-            <w:tcW w:type="dxa" w:w="1928"/>
+            <w:tcW w:type="dxa" w:w="2494"/>
           </w:tcPr>
           <w:p>
             <w:pPr>
@@ -2057,13 +2061,13 @@
                 <w:b w:val="0"/>
                 <w:sz w:val="19"/>
               </w:rPr>
-              <w:t>2.000 / 2.016</w:t>
+              <w:t>2.000 / 2.016 (0.8 %)</w:t>
             </w:r>
           </w:p>
         </w:tc>
         <w:tc>
           <w:tcPr>
-            <w:tcW w:type="dxa" w:w="1928"/>
+            <w:tcW w:type="dxa" w:w="2494"/>
           </w:tcPr>
           <w:p>
             <w:pPr>
@@ -2077,7 +2081,7 @@
                 <w:b w:val="0"/>
                 <w:sz w:val="19"/>
               </w:rPr>
-              <w:t>10.000 / 9.183</w:t>
+              <w:t>10.000 / 9.183 (8.2 %)</w:t>
             </w:r>
           </w:p>
         </w:tc>
@@ -2085,11 +2089,11 @@
       <w:tr>
         <w:tc>
           <w:tcPr>
-            <w:tcW w:type="dxa" w:w="3288"/>
+            <w:tcW w:type="dxa" w:w="1587"/>
           </w:tcPr>
           <w:p>
             <w:pPr>
-              <w:keepNext/>
+              <w:keepNext w:val="0"/>
               <w:spacing w:before="40" w:after="40" w:line="240" w:lineRule="auto"/>
             </w:pPr>
             <w:r/>
@@ -2113,94 +2117,13 @@
                 <w:b/>
                 <w:sz w:val="19"/>
               </w:rPr>
-              <w:t xml:space="preserve"> teórico / simulado (min)</w:t>
+              <w:t xml:space="preserve"> (min)</w:t>
             </w:r>
           </w:p>
         </w:tc>
         <w:tc>
           <w:tcPr>
-            <w:tcW w:type="dxa" w:w="1928"/>
-          </w:tcPr>
-          <w:p>
-            <w:pPr>
-              <w:keepNext/>
-              <w:spacing w:before="40" w:after="40" w:line="240" w:lineRule="auto"/>
-              <w:jc w:val="center"/>
-            </w:pPr>
-            <w:r/>
-            <w:r>
-              <w:rPr>
-                <w:b w:val="0"/>
-                <w:sz w:val="19"/>
-              </w:rPr>
-              <w:t>0.667 / 0.685</w:t>
-            </w:r>
-          </w:p>
-        </w:tc>
-        <w:tc>
-          <w:tcPr>
-            <w:tcW w:type="dxa" w:w="1928"/>
-          </w:tcPr>
-          <w:p>
-            <w:pPr>
-              <w:keepNext/>
-              <w:spacing w:before="40" w:after="40" w:line="240" w:lineRule="auto"/>
-              <w:jc w:val="center"/>
-            </w:pPr>
-            <w:r/>
-            <w:r>
-              <w:rPr>
-                <w:b w:val="0"/>
-                <w:sz w:val="19"/>
-              </w:rPr>
-              <w:t>1.667 / 1.681</w:t>
-            </w:r>
-          </w:p>
-        </w:tc>
-        <w:tc>
-          <w:tcPr>
-            <w:tcW w:type="dxa" w:w="1928"/>
-          </w:tcPr>
-          <w:p>
-            <w:pPr>
-              <w:keepNext/>
-              <w:spacing w:before="40" w:after="40" w:line="240" w:lineRule="auto"/>
-              <w:jc w:val="center"/>
-            </w:pPr>
-            <w:r/>
-            <w:r>
-              <w:rPr>
-                <w:b w:val="0"/>
-                <w:sz w:val="19"/>
-              </w:rPr>
-              <w:t>9.667 / 8.849</w:t>
-            </w:r>
-          </w:p>
-        </w:tc>
-      </w:tr>
-      <w:tr>
-        <w:tc>
-          <w:tcPr>
-            <w:tcW w:type="dxa" w:w="3288"/>
-          </w:tcPr>
-          <w:p>
-            <w:pPr>
-              <w:keepNext w:val="0"/>
-              <w:spacing w:before="40" w:after="40" w:line="240" w:lineRule="auto"/>
-            </w:pPr>
-            <w:r/>
-            <w:r>
-              <w:rPr>
-                <w:b/>
-                <w:sz w:val="19"/>
-              </w:rPr>
-              <w:t>Error máximo</w:t>
-            </w:r>
-          </w:p>
-        </w:tc>
-        <w:tc>
-          <w:tcPr>
-            <w:tcW w:type="dxa" w:w="1928"/>
+            <w:tcW w:type="dxa" w:w="2494"/>
           </w:tcPr>
           <w:p>
             <w:pPr>
@@ -2214,13 +2137,13 @@
                 <w:b w:val="0"/>
                 <w:sz w:val="19"/>
               </w:rPr>
-              <w:t>2.8 %</w:t>
+              <w:t>0.667 / 0.685 (2.8 %)</w:t>
             </w:r>
           </w:p>
         </w:tc>
         <w:tc>
           <w:tcPr>
-            <w:tcW w:type="dxa" w:w="1928"/>
+            <w:tcW w:type="dxa" w:w="2494"/>
           </w:tcPr>
           <w:p>
             <w:pPr>
@@ -2234,13 +2157,13 @@
                 <w:b w:val="0"/>
                 <w:sz w:val="19"/>
               </w:rPr>
-              <w:t>0.9 %</w:t>
+              <w:t>1.667 / 1.681 (0.9 %)</w:t>
             </w:r>
           </w:p>
         </w:tc>
         <w:tc>
           <w:tcPr>
-            <w:tcW w:type="dxa" w:w="1928"/>
+            <w:tcW w:type="dxa" w:w="2494"/>
           </w:tcPr>
           <w:p>
             <w:pPr>
@@ -2254,13 +2177,17 @@
                 <w:b w:val="0"/>
                 <w:sz w:val="19"/>
               </w:rPr>
-              <w:t>8.6 %</w:t>
+              <w:t>9.667 / 8.849 (8.5 %)</w:t>
             </w:r>
           </w:p>
         </w:tc>
       </w:tr>
     </w:tbl>
-    <w:p/>
+    <w:p>
+      <w:pPr>
+        <w:spacing w:after="0"/>
+      </w:pPr>
+    </w:p>
     <w:p>
       <w:pPr>
         <w:keepNext/>
@@ -2269,7 +2196,7 @@
       <w:r>
         <w:drawing>
           <wp:inline xmlns:a="http://schemas.openxmlformats.org/drawingml/2006/main" xmlns:pic="http://schemas.openxmlformats.org/drawingml/2006/picture">
-            <wp:extent cx="4860000" cy="2871818"/>
+            <wp:extent cx="5760000" cy="1440000"/>
             <wp:docPr id="4" name="Picture 4"/>
             <wp:cNvGraphicFramePr>
               <a:graphicFrameLocks noChangeAspect="1"/>
@@ -2290,7 +2217,7 @@
                   <pic:spPr>
                     <a:xfrm>
                       <a:off x="0" y="0"/>
-                      <a:ext cx="4860000" cy="2871818"/>
+                      <a:ext cx="5760000" cy="1440000"/>
                     </a:xfrm>
                     <a:prstGeom prst="rect"/>
                   </pic:spPr>
@@ -2310,7 +2237,7 @@
           <w:b w:val="0"/>
           <w:sz w:val="18"/>
         </w:rPr>
-        <w:t>Figura 4. Comparación de las métricas teóricas y simuladas por escenario.</w:t>
+        <w:t>Figura 4. Métricas teóricas y simuladas por escenario.</w:t>
       </w:r>
     </w:p>
     <w:p>
@@ -2321,7 +2248,7 @@
         <w:rPr>
           <w:b w:val="0"/>
         </w:rPr>
-        <w:t>La comparación demuestra que la simulación sigue la misma tendencia que la teoría: a mayor utilización del servidor, aumentan los tiempos de espera y el número de clientes en el sistema.</w:t>
+        <w:t>De la Tabla 2 y la Figura 4 se desprenden tres observaciones:</w:t>
       </w:r>
     </w:p>
     <w:p>
@@ -2334,26 +2261,13 @@
         <w:rPr>
           <w:b/>
         </w:rPr>
-        <w:t>Sistema estable:</w:t>
+        <w:t>La utilización es la métrica más precisa</w:t>
       </w:r>
       <w:r>
         <w:rPr>
           <w:b w:val="0"/>
         </w:rPr>
-        <w:t xml:space="preserve"> los valores simulados quedan muy cerca de los teóricos, con un error máximo de 2.8 % (W</w:t>
-      </w:r>
-      <w:r>
-        <w:rPr>
-          <w:b w:val="0"/>
-          <w:vertAlign w:val="subscript"/>
-        </w:rPr>
-        <w:t>q</w:t>
-      </w:r>
-      <w:r>
-        <w:rPr>
-          <w:b w:val="0"/>
-        </w:rPr>
-        <w:t>: 0.667 frente a 0.685).</w:t>
+        <w:t xml:space="preserve"> en los tres escenarios (error de 0.5 % o menos), porque solo mide la fracción de tiempo en que la caja está ocupada y se estabiliza pronto.</w:t>
       </w:r>
     </w:p>
     <w:p>
@@ -2366,13 +2280,13 @@
         <w:rPr>
           <w:b/>
         </w:rPr>
-        <w:t>Mayor utilización:</w:t>
+        <w:t>En los escenarios 1 y 2 la simulación reproduce la teoría</w:t>
       </w:r>
       <w:r>
         <w:rPr>
           <w:b w:val="0"/>
         </w:rPr>
-        <w:t xml:space="preserve"> la coincidencia es todavía mayor, con errores menores al 1 % en todas las métricas.</w:t>
+        <w:t>, con errores entre 0.6 % y 2.8 % en las métricas de la cola. Esto valida tanto el modelo como su implementación.</w:t>
       </w:r>
     </w:p>
     <w:p>
@@ -2385,37 +2299,13 @@
         <w:rPr>
           <w:b/>
         </w:rPr>
-        <w:t>Cerca de la saturación:</w:t>
+        <w:t>En el escenario 3 las métricas de la cola se alejan entre 8.2 % y 8.6 %</w:t>
       </w:r>
       <w:r>
         <w:rPr>
           <w:b w:val="0"/>
         </w:rPr>
-        <w:t xml:space="preserve"> la diferencia crece hasta 8.6 % (L</w:t>
-      </w:r>
-      <w:r>
-        <w:rPr>
-          <w:b w:val="0"/>
-          <w:vertAlign w:val="subscript"/>
-        </w:rPr>
-        <w:t>q</w:t>
-      </w:r>
-      <w:r>
-        <w:rPr>
-          <w:b w:val="0"/>
-        </w:rPr>
-        <w:t>: 28.033 frente a 25.624). Con ρ = 0.967 la cola oscila mucho y tarda en alcanzar el estado estable, por lo que ni siquiera 20 000 minutos bastan para que el promedio simulado converja al valor teórico.</w:t>
-      </w:r>
-    </w:p>
-    <w:p>
-      <w:pPr>
-        <w:jc w:val="both"/>
-      </w:pPr>
-      <w:r>
-        <w:rPr>
-          <w:b w:val="0"/>
-        </w:rPr>
-        <w:t>En resumen, la simulación muestra cómo se comporta el sistema en el tiempo, mientras que los resultados teóricos actúan como una base matemática de referencia. Las diferencias se deben a la aleatoriedad y a la duración finita de la simulación, y aumentan cerca de la saturación.</w:t>
+        <w:t>, por encima del 5 % que la clase propone como criterio de validación. No se trata de un error del código, sino de que el promedio simulado todavía no se estabiliza, como muestra la Figura 5; para cumplir el criterio habría que usar varias réplicas y descartar el periodo de calentamiento.</w:t>
       </w:r>
     </w:p>
     <w:p>
@@ -2426,8 +2316,8 @@
       <w:r>
         <w:drawing>
           <wp:inline xmlns:a="http://schemas.openxmlformats.org/drawingml/2006/main" xmlns:pic="http://schemas.openxmlformats.org/drawingml/2006/picture">
-            <wp:extent cx="5400000" cy="2454545"/>
-            <wp:docPr id="6" name="Picture 6"/>
+            <wp:extent cx="5760000" cy="2618182"/>
+            <wp:docPr id="5" name="Picture 5"/>
             <wp:cNvGraphicFramePr>
               <a:graphicFrameLocks noChangeAspect="1"/>
             </wp:cNvGraphicFramePr>
@@ -2439,7 +2329,7 @@
                     <pic:cNvPicPr/>
                   </pic:nvPicPr>
                   <pic:blipFill>
-                    <a:blip r:embed="rId15"/>
+                    <a:blip r:embed="rId14"/>
                     <a:stretch>
                       <a:fillRect/>
                     </a:stretch>
@@ -2447,7 +2337,7 @@
                   <pic:spPr>
                     <a:xfrm>
                       <a:off x="0" y="0"/>
-                      <a:ext cx="5400000" cy="2454545"/>
+                      <a:ext cx="5760000" cy="2618182"/>
                     </a:xfrm>
                     <a:prstGeom prst="rect"/>
                   </pic:spPr>
@@ -2467,29 +2357,7 @@
           <w:b w:val="0"/>
           <w:sz w:val="18"/>
         </w:rPr>
-        <w:t xml:space="preserve">Figura 5. Promedio acumulado de la espera en cola frente al número de clientes atendidos; las líneas punteadas son </w:t>
-      </w:r>
-      <w:r>
-        <w:rPr>
-          <w:b w:val="0"/>
-          <w:sz w:val="18"/>
-        </w:rPr>
-        <w:t>W</w:t>
-      </w:r>
-      <w:r>
-        <w:rPr>
-          <w:b w:val="0"/>
-          <w:sz w:val="18"/>
-          <w:vertAlign w:val="subscript"/>
-        </w:rPr>
-        <w:t>q</w:t>
-      </w:r>
-      <w:r>
-        <w:rPr>
-          <w:b w:val="0"/>
-          <w:sz w:val="18"/>
-        </w:rPr>
-        <w:t xml:space="preserve"> teórico.</w:t>
+        <w:t>Figura 5. Promedio acumulado de la espera en cola frente al número de clientes atendidos.</w:t>
       </w:r>
     </w:p>
     <w:p>
@@ -2500,13 +2368,7 @@
         <w:rPr>
           <w:b w:val="0"/>
         </w:rPr>
-        <w:t xml:space="preserve">La Figura 5 muestra cómo evoluciona el promedio de la espera en cola a medida que se atienden clientes. Al inicio el promedio oscila mucho porque se calcula con pocos clientes; por la ley de los grandes números, con más clientes se acerca al valor teórico. En los escenarios 1 y 2 la curva llega a </w:t>
-      </w:r>
-      <w:r>
-        <w:rPr>
-          <w:b w:val="0"/>
-        </w:rPr>
-        <w:t>W</w:t>
+        <w:t>La Figura 5 muestra cómo evoluciona el promedio de la espera en cola a medida que se atienden clientes. En los escenarios 1 y 2 la curva se acerca a W</w:t>
       </w:r>
       <w:r>
         <w:rPr>
@@ -2519,7 +2381,18 @@
         <w:rPr>
           <w:b w:val="0"/>
         </w:rPr>
-        <w:t xml:space="preserve"> después de unos pocos miles de clientes y ya no se separa. En el escenario 3, en cambio, sube hasta cerca de 17 minutos y después de casi 58 000 clientes todavía termina en 8.85 minutos, por debajo de los 9.67 teóricos: cerca de la saturación, la simulación necesita muchísimo más tiempo para estabilizarse. Esto explica la diferencia de 8.6 % de la Tabla 2.</w:t>
+        <w:t xml:space="preserve"> después de unos pocos miles de clientes y ya no se separa. En el escenario 3, en cambio, sube hasta cerca de 17 minutos y después de casi 58 000 clientes todavía cruza el valor teórico de 9.67 minutos: cerca de la saturación, la simulación necesita muchísimo más tiempo para estabilizarse.</w:t>
+      </w:r>
+    </w:p>
+    <w:p>
+      <w:pPr>
+        <w:jc w:val="both"/>
+      </w:pPr>
+      <w:r>
+        <w:rPr>
+          <w:b w:val="0"/>
+        </w:rPr>
+        <w:t>Como verificación interna, los resultados simulados cumplen la ley de Little: λ · W da 2.044, 5.040 y 26.631 clientes, frente a un L simulado de 2.036, 5.029 y 26.592. La diferencia es menor al 0.5 % en los tres escenarios, lo que indica que el modelo registra de forma coherente las llegadas, las esperas y las salidas de los clientes.</w:t>
       </w:r>
     </w:p>
     <w:p>
@@ -2542,8 +2415,8 @@
       <w:r>
         <w:drawing>
           <wp:inline xmlns:a="http://schemas.openxmlformats.org/drawingml/2006/main" xmlns:pic="http://schemas.openxmlformats.org/drawingml/2006/picture">
-            <wp:extent cx="3960000" cy="3024000"/>
-            <wp:docPr id="7" name="Picture 7"/>
+            <wp:extent cx="5040000" cy="3848727"/>
+            <wp:docPr id="6" name="Picture 6"/>
             <wp:cNvGraphicFramePr>
               <a:graphicFrameLocks noChangeAspect="1"/>
             </wp:cNvGraphicFramePr>
@@ -2555,7 +2428,7 @@
                     <pic:cNvPicPr/>
                   </pic:nvPicPr>
                   <pic:blipFill>
-                    <a:blip r:embed="rId16"/>
+                    <a:blip r:embed="rId15"/>
                     <a:stretch>
                       <a:fillRect/>
                     </a:stretch>
@@ -2563,7 +2436,7 @@
                   <pic:spPr>
                     <a:xfrm>
                       <a:off x="0" y="0"/>
-                      <a:ext cx="3960000" cy="3024000"/>
+                      <a:ext cx="5040000" cy="3848727"/>
                     </a:xfrm>
                     <a:prstGeom prst="rect"/>
                   </pic:spPr>
@@ -2583,59 +2456,7 @@
           <w:b w:val="0"/>
           <w:sz w:val="18"/>
         </w:rPr>
-        <w:t xml:space="preserve">Figura 6. Tamaño de la cola durante una jornada de 8 horas en cada escenario; la línea punteada es </w:t>
-      </w:r>
-      <w:r>
-        <w:rPr>
-          <w:b w:val="0"/>
-          <w:sz w:val="18"/>
-        </w:rPr>
-        <w:t>L</w:t>
-      </w:r>
-      <w:r>
-        <w:rPr>
-          <w:b w:val="0"/>
-          <w:sz w:val="18"/>
-          <w:vertAlign w:val="subscript"/>
-        </w:rPr>
-        <w:t>q</w:t>
-      </w:r>
-      <w:r>
-        <w:rPr>
-          <w:b w:val="0"/>
-          <w:sz w:val="18"/>
-        </w:rPr>
-        <w:t xml:space="preserve"> teórico.</w:t>
-      </w:r>
-    </w:p>
-    <w:p>
-      <w:pPr>
-        <w:jc w:val="both"/>
-      </w:pPr>
-      <w:r>
-        <w:rPr>
-          <w:b w:val="0"/>
-        </w:rPr>
-        <w:t xml:space="preserve">La Figura 6 muestra la cola minuto a minuto durante las primeras 8 horas. En el escenario 1 la cola vuelve a cero con frecuencia y sus picos, de hasta 20 clientes, desaparecen en pocos minutos; en el escenario 2 los episodios de cola larga duran más y llegan a 29 clientes; en el escenario 3 la cola ya no se vacía con facilidad y la jornada termina con 69 clientes en espera. </w:t>
-      </w:r>
-      <w:r>
-        <w:rPr>
-          <w:b w:val="0"/>
-        </w:rPr>
-        <w:t>L</w:t>
-      </w:r>
-      <w:r>
-        <w:rPr>
-          <w:b w:val="0"/>
-          <w:vertAlign w:val="subscript"/>
-        </w:rPr>
-        <w:t>q</w:t>
-      </w:r>
-      <w:r>
-        <w:rPr>
-          <w:b w:val="0"/>
-        </w:rPr>
-        <w:t xml:space="preserve"> es un promedio a largo plazo y no un máximo: por la aleatoriedad de las llegadas y de la atención, la cola real sube y baja alrededor de ese valor.</w:t>
+        <w:t>Figura 6. Tamaño de la cola durante una jornada de 8 horas en cada escenario.</w:t>
       </w:r>
     </w:p>
     <w:p>
@@ -2646,8 +2467,8 @@
       <w:r>
         <w:drawing>
           <wp:inline xmlns:a="http://schemas.openxmlformats.org/drawingml/2006/main" xmlns:pic="http://schemas.openxmlformats.org/drawingml/2006/picture">
-            <wp:extent cx="4500000" cy="1428571"/>
-            <wp:docPr id="8" name="Picture 8"/>
+            <wp:extent cx="5760000" cy="1828571"/>
+            <wp:docPr id="7" name="Picture 7"/>
             <wp:cNvGraphicFramePr>
               <a:graphicFrameLocks noChangeAspect="1"/>
             </wp:cNvGraphicFramePr>
@@ -2659,7 +2480,7 @@
                     <pic:cNvPicPr/>
                   </pic:nvPicPr>
                   <pic:blipFill>
-                    <a:blip r:embed="rId17"/>
+                    <a:blip r:embed="rId16"/>
                     <a:stretch>
                       <a:fillRect/>
                     </a:stretch>
@@ -2667,7 +2488,7 @@
                   <pic:spPr>
                     <a:xfrm>
                       <a:off x="0" y="0"/>
-                      <a:ext cx="4500000" cy="1428571"/>
+                      <a:ext cx="5760000" cy="1828571"/>
                     </a:xfrm>
                     <a:prstGeom prst="rect"/>
                   </pic:spPr>
@@ -2687,59 +2508,64 @@
           <w:b w:val="0"/>
           <w:sz w:val="18"/>
         </w:rPr>
-        <w:t xml:space="preserve">Figura 7. Distribución de los tiempos de espera en cola de los clientes simulados; la línea punteada es </w:t>
-      </w:r>
-      <w:r>
-        <w:rPr>
-          <w:b w:val="0"/>
-          <w:sz w:val="18"/>
-        </w:rPr>
-        <w:t>W</w:t>
-      </w:r>
-      <w:r>
-        <w:rPr>
-          <w:b w:val="0"/>
-          <w:sz w:val="18"/>
-          <w:vertAlign w:val="subscript"/>
-        </w:rPr>
-        <w:t>q</w:t>
-      </w:r>
-      <w:r>
-        <w:rPr>
-          <w:b w:val="0"/>
-          <w:sz w:val="18"/>
-        </w:rPr>
-        <w:t xml:space="preserve"> teórico.</w:t>
+        <w:t>Figura 7. Distribución de los tiempos de espera en cola de los clientes simulados.</w:t>
       </w:r>
     </w:p>
     <w:p>
       <w:pPr>
+        <w:pStyle w:val="ListBullet"/>
+        <w:spacing w:after="60"/>
         <w:jc w:val="both"/>
       </w:pPr>
       <w:r>
         <w:rPr>
-          <w:b w:val="0"/>
+          <w:b/>
         </w:rPr>
-        <w:t xml:space="preserve">La Figura 7 muestra que la mayoría de los clientes espera poco o nada y que unos pocos esperan mucho, lo que forma una cola larga hacia la derecha. Por eso el promedio queda por encima de la espera típica: la mediana es de 0.29, 1.05 y 6.95 minutos, frente a un </w:t>
+        <w:t>Escenario 1 (ρ = 0.667):</w:t>
       </w:r>
       <w:r>
         <w:rPr>
           <w:b w:val="0"/>
         </w:rPr>
-        <w:t>W</w:t>
+        <w:t xml:space="preserve"> la caja está libre un tercio del tiempo, por lo que uno de cada tres clientes no espera nada. La cola vuelve a cero con frecuencia y sus picos, de hasta 20 clientes en la jornada de la Figura 6, desaparecen en pocos minutos. Aun así, de cada minuto que un cliente pasa en el sistema, 0.667 minutos los pasa esperando.</w:t>
       </w:r>
+    </w:p>
+    <w:p>
+      <w:pPr>
+        <w:pStyle w:val="ListBullet"/>
+        <w:spacing w:after="60"/>
+        <w:jc w:val="both"/>
+      </w:pPr>
       <w:r>
         <w:rPr>
-          <w:b w:val="0"/>
-          <w:vertAlign w:val="subscript"/>
+          <w:b/>
         </w:rPr>
-        <w:t>q</w:t>
+        <w:t>Escenario 2 (ρ = 0.833):</w:t>
       </w:r>
       <w:r>
         <w:rPr>
           <w:b w:val="0"/>
         </w:rPr>
-        <w:t xml:space="preserve"> de 0.67, 1.67 y 9.67 minutos. La proporción de clientes que no espera coincide con la teoría del M/M/1, 1 − ρ: 33.1 %, 16.5 % y 3.2 % en la simulación, frente a 33.3 %, 16.7 % y 3.3 %.</w:t>
+        <w:t xml:space="preserve"> λ aumenta 25 % respecto al escenario 1, pero L se multiplica por 2.5 y W por 2. Con ρ = 0.833 el sistema ya supera el punto de operación seguro de ρ ≤ 0.8: los episodios de cola larga duran más, y la cola llega a 29 clientes durante la jornada.</w:t>
+      </w:r>
+    </w:p>
+    <w:p>
+      <w:pPr>
+        <w:pStyle w:val="ListBullet"/>
+        <w:spacing w:after="60"/>
+        <w:jc w:val="both"/>
+      </w:pPr>
+      <w:r>
+        <w:rPr>
+          <w:b/>
+        </w:rPr>
+        <w:t>Escenario 3 (ρ = 0.967):</w:t>
+      </w:r>
+      <w:r>
+        <w:rPr>
+          <w:b w:val="0"/>
+        </w:rPr>
+        <w:t xml:space="preserve"> λ aumenta 45 % respecto al escenario 1, pero W pasa de 1 a 10 minutos y L de 2 a 29 clientes. La cola ya no se vacía con facilidad: la jornada simulada termina con cerca de 70 clientes en espera, y en la Figura 7 algunos clientes esperan más de 40 minutos. Solo el 3.3 % de los clientes encuentra la caja libre.</w:t>
       </w:r>
     </w:p>
     <w:p>
@@ -2750,8 +2576,8 @@
       <w:r>
         <w:drawing>
           <wp:inline xmlns:a="http://schemas.openxmlformats.org/drawingml/2006/main" xmlns:pic="http://schemas.openxmlformats.org/drawingml/2006/picture">
-            <wp:extent cx="3780000" cy="2886545"/>
-            <wp:docPr id="5" name="Picture 5"/>
+            <wp:extent cx="5760000" cy="4398545"/>
+            <wp:docPr id="8" name="Picture 8"/>
             <wp:cNvGraphicFramePr>
               <a:graphicFrameLocks noChangeAspect="1"/>
             </wp:cNvGraphicFramePr>
@@ -2763,7 +2589,7 @@
                     <pic:cNvPicPr/>
                   </pic:nvPicPr>
                   <pic:blipFill>
-                    <a:blip r:embed="rId14"/>
+                    <a:blip r:embed="rId17"/>
                     <a:stretch>
                       <a:fillRect/>
                     </a:stretch>
@@ -2771,7 +2597,7 @@
                   <pic:spPr>
                     <a:xfrm>
                       <a:off x="0" y="0"/>
-                      <a:ext cx="3780000" cy="2886545"/>
+                      <a:ext cx="5760000" cy="4398545"/>
                     </a:xfrm>
                     <a:prstGeom prst="rect"/>
                   </pic:spPr>
@@ -2817,7 +2643,7 @@
         <w:rPr>
           <w:b w:val="0"/>
         </w:rPr>
-        <w:t>En la Figura 8 cada punto es un cliente. En el escenario 1 las esperas no pasan de 7.7 minutos y los picos son aislados; en el escenario 2 llegan a 18.8 minutos. En el escenario 3 las esperas forman rachas largas que llegan a 45.8 minutos: hasta 2 636 clientes seguidos esperan más que W</w:t>
+        <w:t>La Figura 8 muestra la espera de cada cliente en el orden en que llegó. En el escenario 1 las esperas no pasan de 7.7 minutos y los picos son aislados; en el escenario 2 llegan a 18.8 minutos. En el escenario 3 las esperas forman rachas largas que llegan a 45.8 minutos, y hasta 2 636 clientes seguidos esperan más que W</w:t>
       </w:r>
       <w:r>
         <w:rPr>
@@ -2830,7 +2656,7 @@
         <w:rPr>
           <w:b w:val="0"/>
         </w:rPr>
-        <w:t>, por lo que el promedio de la Figura 5 tarda mucho en estabilizarse.</w:t>
+        <w:t>. Esas rachas son la razón por la que el promedio de la Figura 5 tarda tanto en converger.</w:t>
       </w:r>
     </w:p>
     <w:p>
@@ -2841,7 +2667,7 @@
         <w:rPr>
           <w:b w:val="0"/>
         </w:rPr>
-        <w:t>En el primer escenario el sistema opera de forma estable; en el segundo, el servidor se utiliza más y los clientes esperan más tiempo; y en el tercero, el sistema se acerca a su capacidad, lo que genera un aumento significativo de la cola: L pasa de 2 a 29 clientes y W de 1 a 10 minutos, un crecimiento no lineal frente al aumento de ρ. Esto muestra que mantener un equilibrio entre la tasa de llegada y la tasa de servicio es clave para el buen funcionamiento del sistema M/M/1.</w:t>
+        <w:t>El crecimiento no es lineal porque W = 1/(μ − λ) depende de la holgura μ − λ, que en los tres escenarios vale 1.0, 0.5 y 0.1 clientes/min. Reducir esa holgura a la décima parte multiplica por diez el tiempo que el cliente pasa en el sistema. Para la caja rápida, esto significa que con ρ cercano a 1 una mejora pequeña no alcanza: habría que abrir una segunda caja o reducir el tiempo de atención.</w:t>
       </w:r>
     </w:p>
     <w:p>
@@ -2858,7 +2684,7 @@
         <w:rPr>
           <w:b w:val="0"/>
         </w:rPr>
-        <w:t xml:space="preserve"> https://github.com/AlejandroTatum/simulacion-ape-3-mm1</w:t>
+        <w:t xml:space="preserve"> https://github.com/AlejandroTatum/simulacion-unl/tree/main/unidad-1/ape-3-mm1</w:t>
       </w:r>
     </w:p>
     <w:p>
@@ -2894,7 +2720,7 @@
         <w:rPr>
           <w:b w:val="0"/>
         </w:rPr>
-        <w:t>Representa un sistema de líneas de espera con llegadas de clientes según una distribución de Poisson, tiempos de servicio con distribución exponencial, un único servidor y atención bajo el principio FIFO (primero en llegar, primero en ser atendido).</w:t>
+        <w:t>En la notación de Kendall A/B/c/K/N/D, el M/M/1 corresponde a M/M/1/∞/∞/FIFO: llegadas de Poisson (A = M, de Markov, sin memoria), servicio exponencial (B = M), un solo servidor (c = 1), capacidad ilimitada (K = ∞), población infinita (N = ∞) y disciplina FIFO. Es el caso más simple de la teoría de colas: sus supuestos son restrictivos, pero permiten fórmulas cerradas para todas las métricas. En esta práctica representa la caja rápida de un supermercado con una sola cajera.</w:t>
       </w:r>
     </w:p>
     <w:p>
@@ -2917,7 +2743,7 @@
         <w:rPr>
           <w:b w:val="0"/>
         </w:rPr>
-        <w:t>λ representa la tasa promedio de llegada de clientes, y μ representa la tasa promedio de servicio del servidor.</w:t>
+        <w:t>λ es la tasa de llegada, es decir, los clientes que llegan por unidad de tiempo, y determina la demanda del sistema; μ es la tasa de servicio, los clientes que el servidor atiende por unidad de tiempo, y determina su capacidad. En los escenarios, λ vale 2.0, 2.5 y 2.9 clientes/min y μ = 3.0 clientes/min. Sus inversos son el tiempo medio entre llegadas (E[T] = 1/λ) y el tiempo medio de atención: con μ = 3.0, cada atención dura en promedio 1/3 de minuto (20 segundos).</w:t>
       </w:r>
     </w:p>
     <w:p>
@@ -2940,7 +2766,7 @@
         <w:rPr>
           <w:b w:val="0"/>
         </w:rPr>
-        <w:t>Porque si la tasa de llegada fuera mayor o igual a la tasa de servicio (λ ≥ μ), el servidor no daría abasto para atender a todos los clientes que llegan, provocando que la cola crezca indefinidamente y el sistema no sea estable.</w:t>
+        <w:t>Porque la condición de estabilidad es ρ = λ/μ &lt; 1, que equivale a λ &lt; μ. Si ρ ≥ 1 llegan, en promedio, al menos tantos clientes como los que el servidor puede atender, las colas crecen sin límite y ni las fórmulas del M/M/1 ni la ley de Little son válidas: todas las fórmulas tienen μ − λ en el denominador. Por eso el código rechaza esos casos con un error antes de calcular.</w:t>
       </w:r>
     </w:p>
     <w:p>
@@ -2963,7 +2789,7 @@
         <w:rPr>
           <w:b w:val="0"/>
         </w:rPr>
-        <w:t>Representa la utilización del servidor, calculada como ρ = λ/μ, e indica la proporción de tiempo que el servidor se encuentra ocupado atendiendo clientes.</w:t>
+        <w:t>ρ = λ/μ es la fracción del tiempo en que el servidor está ocupado, y P₀ = 1 − ρ es la probabilidad de que el sistema esté vacío. En el escenario 1, ρ = 0.667 significa que la caja está ocupada dos tercios del tiempo y libre el tercio restante (P₀ = 0.333); la simulación midió 0.670. Como referencia práctica se recomienda operar con ρ ≤ 0.8, valor que los escenarios 2 y 3 superan.</w:t>
       </w:r>
     </w:p>
     <w:p>
@@ -2999,7 +2825,7 @@
         <w:rPr>
           <w:b w:val="0"/>
         </w:rPr>
-        <w:t>W es el tiempo promedio total que un cliente permanece en el sistema (incluyendo el tiempo de espera y el de servicio), mientras que W</w:t>
+        <w:t>W es el tiempo esperado total en el sistema (espera más servicio) y W</w:t>
       </w:r>
       <w:r>
         <w:rPr>
@@ -3012,7 +2838,20 @@
         <w:rPr>
           <w:b w:val="0"/>
         </w:rPr>
-        <w:t xml:space="preserve"> es únicamente el tiempo promedio que un cliente espera en la cola antes de ser atendido.</w:t>
+        <w:t xml:space="preserve"> es el tiempo esperado en la cola antes de iniciar el servicio. Se diferencian justamente en el tiempo medio de servicio: W = W</w:t>
+      </w:r>
+      <w:r>
+        <w:rPr>
+          <w:b w:val="0"/>
+          <w:vertAlign w:val="subscript"/>
+        </w:rPr>
+        <w:t>q</w:t>
+      </w:r>
+      <w:r>
+        <w:rPr>
+          <w:b w:val="0"/>
+        </w:rPr>
+        <w:t xml:space="preserve"> + 1/μ. En el escenario 1, 1.000 = 0.667 + 0.333 minutos.</w:t>
       </w:r>
     </w:p>
     <w:p>
@@ -3048,7 +2887,7 @@
         <w:rPr>
           <w:b w:val="0"/>
         </w:rPr>
-        <w:t>L es el número promedio total de clientes en el sistema (tanto en la cola como siendo atendidos), mientras que L</w:t>
+        <w:t>L es el número esperado de clientes en el sistema (cola más servicio) y L</w:t>
       </w:r>
       <w:r>
         <w:rPr>
@@ -3061,7 +2900,46 @@
         <w:rPr>
           <w:b w:val="0"/>
         </w:rPr>
-        <w:t xml:space="preserve"> es exclusivamente el número promedio de clientes que esperan en la cola.</w:t>
+        <w:t xml:space="preserve"> el número esperado de clientes que esperan a ser atendidos. Ambas se relacionan con los tiempos por la ley de Little, L = λW y L</w:t>
+      </w:r>
+      <w:r>
+        <w:rPr>
+          <w:b w:val="0"/>
+          <w:vertAlign w:val="subscript"/>
+        </w:rPr>
+        <w:t>q</w:t>
+      </w:r>
+      <w:r>
+        <w:rPr>
+          <w:b w:val="0"/>
+        </w:rPr>
+        <w:t xml:space="preserve"> = λW</w:t>
+      </w:r>
+      <w:r>
+        <w:rPr>
+          <w:b w:val="0"/>
+          <w:vertAlign w:val="subscript"/>
+        </w:rPr>
+        <w:t>q</w:t>
+      </w:r>
+      <w:r>
+        <w:rPr>
+          <w:b w:val="0"/>
+        </w:rPr>
+        <w:t>; en el escenario 1, L = 2.0 · 1.000 = 2.000 y L</w:t>
+      </w:r>
+      <w:r>
+        <w:rPr>
+          <w:b w:val="0"/>
+          <w:vertAlign w:val="subscript"/>
+        </w:rPr>
+        <w:t>q</w:t>
+      </w:r>
+      <w:r>
+        <w:rPr>
+          <w:b w:val="0"/>
+        </w:rPr>
+        <w:t xml:space="preserve"> = 2.0 · 0.667 = 1.333.</w:t>
       </w:r>
     </w:p>
     <w:p>
@@ -3084,7 +2962,7 @@
         <w:rPr>
           <w:b w:val="0"/>
         </w:rPr>
-        <w:t>Porque en el modelo M/M/1 las llegadas siguen un proceso de Poisson, sin memoria, lo que matemáticamente equivale a que los tiempos entre llegadas sean exponenciales; el servicio también se modela como exponencial. En el código, SimPy solo maneja el tiempo de los eventos, y los tiempos se generan con la distribución exponencial de NumPy.</w:t>
+        <w:t>Porque en un proceso de Poisson con tasa λ el tiempo entre eventos sigue una distribución exponencial de media 1/λ (y varianza 1/λ²). Ese proceso supone eventos independientes, una probabilidad de llegada λΔt en un intervalo corto y falta de memoria: el tiempo hasta la próxima llegada no depende del tiempo transcurrido desde la anterior. El servicio del M/M/1 también es exponencial. En el código, los tiempos se generan con la exponencial de NumPy y SimPy avanza el reloj con env.timeout; los histogramas de la ventana en vivo confirman que siguen la curva teórica.</w:t>
       </w:r>
     </w:p>
     <w:p>
@@ -3107,7 +2985,7 @@
         <w:rPr>
           <w:b w:val="0"/>
         </w:rPr>
-        <w:t>Cuando λ se aproxima a μ (es decir, ρ se acerca a 1), aumentan drásticamente el tiempo de espera y el tamaño de la cola, ya que el servidor trabaja cerca de su capacidad máxima.</w:t>
+        <w:t>Ocurre la inestabilidad por congestión: cuando ρ → 1, todas las métricas tienden a infinito, por ejemplo L = ρ/(1 − ρ). Aunque el servidor parezca alcanzar a atender, la varianza de las distribuciones exponenciales provoca momentos en que llegan muchos clientes seguidos y el servidor ya no recupera el retraso. En la práctica se observó en el escenario 3: con ρ = 0.967, L = 29 clientes y W = 10 minutos, frente a 2 clientes y 1 minuto con ρ = 0.667.</w:t>
       </w:r>
     </w:p>
     <w:p>
@@ -3130,7 +3008,7 @@
         <w:rPr>
           <w:b w:val="0"/>
         </w:rPr>
-        <w:t>Porque los resultados teóricos se calculan mediante fórmulas deterministas basadas en el valor esperado a largo plazo, mientras que los resultados simulados dependen de muestras aleatorias generadas durante un tiempo de simulación finito y están sujetos a la variabilidad estocástica.</w:t>
+        <w:t>Porque las fórmulas dan valores esperados del estado estable, mientras que la simulación estima promedios a partir de una muestra aleatoria finita. Según el criterio de validación de la clase, los errores deben quedar por debajo del 5 % con 30 réplicas de 10 000 minutos; si no, hay que revisar el periodo de calentamiento (warm-up), el número de réplicas y el cálculo de las áreas. En esta práctica se usó una sola réplica de 20 000 minutos sin eliminar el calentamiento: los escenarios 1 y 2 cumplen el criterio, pero el escenario 3 llega a 8.6 %, porque cerca de ρ = 1 la varianza es mayor.</w:t>
       </w:r>
     </w:p>
     <w:p>
@@ -3153,7 +3031,7 @@
         <w:rPr>
           <w:b w:val="0"/>
         </w:rPr>
-        <w:t>El sistema se volvería inestable: los clientes llegarían a un ritmo más rápido del que el servidor es capaz de atender, haciendo que la cola crezca de forma indefinida.</w:t>
+        <w:t>Se tendría ρ &gt; 1 y el sistema sería inestable: las fórmulas del M/M/1 no aplican y la cola crece sin límite, en promedio a razón de λ − μ clientes por unidad de tiempo. Con λ = 3.5 y μ = 3.0, por ejemplo, se acumularían unos 0.5 clientes por minuto, alrededor de 240 al final de una jornada de 8 horas. Solo se puede estabilizar aumentando la capacidad, por ejemplo agregando servidores.</w:t>
       </w:r>
     </w:p>
     <w:p>
@@ -3179,7 +3057,7 @@
         <w:rPr>
           <w:b w:val="0"/>
         </w:rPr>
-        <w:t>La implementación de un modelo M/M/1 en Python mediante SimPy permite mostrar cómo funciona un sistema de colas, tomando en cuenta la llegada de clientes y el servicio proporcionado por un solo servidor.</w:t>
+        <w:t>Se implementó el modelo M/M/1 de la caja rápida en SimPy con semilla configurable. Con 20 000 minutos simulados, los resultados coinciden con la teoría con errores menores al 3 % en los escenarios 1 y 2, lo que valida el modelo y su implementación.</w:t>
       </w:r>
     </w:p>
     <w:p>
@@ -3192,33 +3070,7 @@
         <w:rPr>
           <w:b w:val="0"/>
         </w:rPr>
-        <w:t>Se comprendió la importancia de calcular las métricas L, L</w:t>
-      </w:r>
-      <w:r>
-        <w:rPr>
-          <w:b w:val="0"/>
-          <w:vertAlign w:val="subscript"/>
-        </w:rPr>
-        <w:t>q</w:t>
-      </w:r>
-      <w:r>
-        <w:rPr>
-          <w:b w:val="0"/>
-        </w:rPr>
-        <w:t>, W y W</w:t>
-      </w:r>
-      <w:r>
-        <w:rPr>
-          <w:b w:val="0"/>
-          <w:vertAlign w:val="subscript"/>
-        </w:rPr>
-        <w:t>q</w:t>
-      </w:r>
-      <w:r>
-        <w:rPr>
-          <w:b w:val="0"/>
-        </w:rPr>
-        <w:t>, ya que permiten conocer el número promedio de clientes en el sistema, el tamaño de la fila y los tiempos promedio de espera y de permanencia.</w:t>
+        <w:t>La utilización es la métrica que mejor coincide con la teoría (0.5 % de error o menos), mientras que las métricas de la cola son las más sensibles a la aleatoriedad, en especial cerca de la saturación, donde el error llega a 8.6 %.</w:t>
       </w:r>
     </w:p>
     <w:p>
@@ -3231,7 +3083,7 @@
         <w:rPr>
           <w:b w:val="0"/>
         </w:rPr>
-        <w:t>A medida que la tasa de llegada (λ) se acerca a la tasa de servicio (μ), es decir, cuando ρ se aproxima a 1, los tiempos de espera y el tamaño de la cola aumentan de forma drástica, lo que demuestra que el sistema se satura al trabajar cerca de su capacidad máxima.</w:t>
+        <w:t>El desempeño del sistema depende de la holgura μ − λ y no de λ por sí sola: al pasar de ρ = 0.667 a ρ = 0.967, λ aumenta 45 %, pero el tiempo en el sistema se multiplica por diez.</w:t>
       </w:r>
     </w:p>
     <w:p>
@@ -3244,7 +3096,7 @@
         <w:rPr>
           <w:b w:val="0"/>
         </w:rPr>
-        <w:t>Los resultados simulados se aproximan a los teóricos con errores menores al 3 % en los escenarios estable y de mayor utilización; cerca de la saturación la diferencia llega a 8.6 %, porque las fórmulas representan valores esperados a largo plazo, mientras que la simulación está sujeta a la aleatoriedad y a un tiempo de ejecución finito.</w:t>
+        <w:t>Cerca de la saturación, la simulación necesita mucho más tiempo para estabilizarse, por lo que la duración de la corrida debe elegirse de acuerdo con ρ antes de comparar con la teoría.</w:t>
       </w:r>
     </w:p>
     <w:p>
@@ -3268,7 +3120,7 @@
         <w:rPr>
           <w:b w:val="0"/>
         </w:rPr>
-        <w:t>Para el desarrollo de la presente práctica, el grupo empleó el agente de programación el Gentleman (Pi) con el modelo Claude en la lectura de la guía, la implementación del modelo en SimPy, las fórmulas teóricas, las pruebas, las gráficas, la ventana en vivo y la redacción del informe. La IA ejecutó las tareas; las decisiones de modelo, formato y contenido las tomó el grupo en cada iteración, y los autores revisaron y validaron los resultados, garantizando la coherencia técnica y académica del trabajo presentado.</w:t>
+        <w:t>En esta práctica utilicé un agente de programación basado en el modelo Claude de Anthropic como herramienta de apoyo para estructurar el código en SimPy, generar las gráficas y la ventana en vivo de Matplotlib, revisar el informe grupal y redactar borradores de esta sección individual. Las decisiones sobre el modelo, los escenarios, la semilla y el formato las tomé junto con el grupo; verifiqué cada resultado ejecutando el código y comparándolo con las fórmulas teóricas, y revisé y ajusté el texto antes de entregarlo.</w:t>
       </w:r>
     </w:p>
     <w:p>

</xml_diff>

<commit_message>
docs(ape-3): fix the individual report layout, Figure 4 and unit name
</commit_message>
<xml_diff>
--- a/unidad-1/ape-3-mm1/documento/APE3.docx
+++ b/unidad-1/ape-3-mm1/documento/APE3.docx
@@ -260,7 +260,7 @@
                 <w:b w:val="0"/>
                 <w:sz w:val="19"/>
               </w:rPr>
-              <w:t>1</w:t>
+              <w:t>U1: Introducción a la Simulación</w:t>
             </w:r>
           </w:p>
         </w:tc>
@@ -2196,7 +2196,7 @@
       <w:r>
         <w:drawing>
           <wp:inline xmlns:a="http://schemas.openxmlformats.org/drawingml/2006/main" xmlns:pic="http://schemas.openxmlformats.org/drawingml/2006/picture">
-            <wp:extent cx="5760000" cy="1440000"/>
+            <wp:extent cx="4860000" cy="2871818"/>
             <wp:docPr id="4" name="Picture 4"/>
             <wp:cNvGraphicFramePr>
               <a:graphicFrameLocks noChangeAspect="1"/>
@@ -2217,7 +2217,7 @@
                   <pic:spPr>
                     <a:xfrm>
                       <a:off x="0" y="0"/>
-                      <a:ext cx="5760000" cy="1440000"/>
+                      <a:ext cx="4860000" cy="2871818"/>
                     </a:xfrm>
                     <a:prstGeom prst="rect"/>
                   </pic:spPr>
@@ -2316,7 +2316,7 @@
       <w:r>
         <w:drawing>
           <wp:inline xmlns:a="http://schemas.openxmlformats.org/drawingml/2006/main" xmlns:pic="http://schemas.openxmlformats.org/drawingml/2006/picture">
-            <wp:extent cx="5760000" cy="2618182"/>
+            <wp:extent cx="5400000" cy="2454545"/>
             <wp:docPr id="5" name="Picture 5"/>
             <wp:cNvGraphicFramePr>
               <a:graphicFrameLocks noChangeAspect="1"/>
@@ -2337,7 +2337,7 @@
                   <pic:spPr>
                     <a:xfrm>
                       <a:off x="0" y="0"/>
-                      <a:ext cx="5760000" cy="2618182"/>
+                      <a:ext cx="5400000" cy="2454545"/>
                     </a:xfrm>
                     <a:prstGeom prst="rect"/>
                   </pic:spPr>
@@ -2415,7 +2415,7 @@
       <w:r>
         <w:drawing>
           <wp:inline xmlns:a="http://schemas.openxmlformats.org/drawingml/2006/main" xmlns:pic="http://schemas.openxmlformats.org/drawingml/2006/picture">
-            <wp:extent cx="5040000" cy="3848727"/>
+            <wp:extent cx="3960000" cy="3024000"/>
             <wp:docPr id="6" name="Picture 6"/>
             <wp:cNvGraphicFramePr>
               <a:graphicFrameLocks noChangeAspect="1"/>
@@ -2436,7 +2436,7 @@
                   <pic:spPr>
                     <a:xfrm>
                       <a:off x="0" y="0"/>
-                      <a:ext cx="5040000" cy="3848727"/>
+                      <a:ext cx="3960000" cy="3024000"/>
                     </a:xfrm>
                     <a:prstGeom prst="rect"/>
                   </pic:spPr>
@@ -2467,7 +2467,7 @@
       <w:r>
         <w:drawing>
           <wp:inline xmlns:a="http://schemas.openxmlformats.org/drawingml/2006/main" xmlns:pic="http://schemas.openxmlformats.org/drawingml/2006/picture">
-            <wp:extent cx="5760000" cy="1828571"/>
+            <wp:extent cx="4680000" cy="1485714"/>
             <wp:docPr id="7" name="Picture 7"/>
             <wp:cNvGraphicFramePr>
               <a:graphicFrameLocks noChangeAspect="1"/>
@@ -2488,7 +2488,7 @@
                   <pic:spPr>
                     <a:xfrm>
                       <a:off x="0" y="0"/>
-                      <a:ext cx="5760000" cy="1828571"/>
+                      <a:ext cx="4680000" cy="1485714"/>
                     </a:xfrm>
                     <a:prstGeom prst="rect"/>
                   </pic:spPr>
@@ -2576,7 +2576,7 @@
       <w:r>
         <w:drawing>
           <wp:inline xmlns:a="http://schemas.openxmlformats.org/drawingml/2006/main" xmlns:pic="http://schemas.openxmlformats.org/drawingml/2006/picture">
-            <wp:extent cx="5760000" cy="4398545"/>
+            <wp:extent cx="3960000" cy="3024000"/>
             <wp:docPr id="8" name="Picture 8"/>
             <wp:cNvGraphicFramePr>
               <a:graphicFrameLocks noChangeAspect="1"/>
@@ -2597,7 +2597,7 @@
                   <pic:spPr>
                     <a:xfrm>
                       <a:off x="0" y="0"/>
-                      <a:ext cx="5760000" cy="4398545"/>
+                      <a:ext cx="3960000" cy="3024000"/>
                     </a:xfrm>
                     <a:prstGeom prst="rect"/>
                   </pic:spPr>

</xml_diff>

<commit_message>
docs(ape-3): make the repository URL a clickable link
</commit_message>
<xml_diff>
--- a/unidad-1/ape-3-mm1/documento/APE3.docx
+++ b/unidad-1/ape-3-mm1/documento/APE3.docx
@@ -2684,8 +2684,18 @@
         <w:rPr>
           <w:b w:val="0"/>
         </w:rPr>
-        <w:t xml:space="preserve"> https://github.com/AlejandroTatum/simulacion-unl/tree/main/unidad-1/ape-3-mm1</w:t>
+        <w:t xml:space="preserve"> </w:t>
       </w:r>
+      <w:hyperlink r:id="rIdRepoLink" w:history="1">
+        <w:r>
+          <w:rPr>
+            <w:b w:val="0"/>
+            <w:color w:val="0563C1"/>
+            <w:u w:val="single"/>
+          </w:rPr>
+          <w:t>https://github.com/AlejandroTatum/simulacion-unl/tree/main/unidad-1/ape-3-mm1</w:t>
+        </w:r>
+      </w:hyperlink>
     </w:p>
     <w:p>
       <w:pPr>

</xml_diff>